<commit_message>
Hardening de segurança e rotas
</commit_message>
<xml_diff>
--- a/docs/Formulavest_Documentacao_TCC.docx
+++ b/docs/Formulavest_Documentacao_TCC.docx
@@ -20,6 +20,7 @@
     </w:p>
     <w:p>
       <w:pPr>
+        <w:pStyle w:val="Title"/>
         <w:spacing w:after="160" w:line="264" w:lineRule="auto"/>
         <w:jc w:val="center"/>
       </w:pPr>
@@ -28,10 +29,10 @@
           <w:rFonts w:ascii="Calibri" w:hAnsi="Calibri"/>
           <w:b/>
           <w:i w:val="0"/>
-          <w:color w:val="2E74B5"/>
+          <w:color w:val="0F172A"/>
           <w:sz w:val="44"/>
         </w:rPr>
-        <w:t>DOCUMENTACAO COMPLETA DO PROJETO</w:t>
+        <w:t>DOCUMENTAÇÃO TÉCNICA E OPERACIONAL</w:t>
       </w:r>
     </w:p>
     <w:p>
@@ -44,7 +45,7 @@
           <w:rFonts w:ascii="Calibri" w:hAnsi="Calibri"/>
           <w:b w:val="0"/>
           <w:i w:val="0"/>
-          <w:color w:val="1F4D78"/>
+          <w:color w:val="64748B"/>
           <w:sz w:val="28"/>
         </w:rPr>
         <w:t>Plataforma Web de Estudos, Simulados, Provas ao Vivo e Gestao Escolar</w:t>
@@ -79,6 +80,7 @@
               <w:end w:w="120" w:type="dxa"/>
             </w:tcMar>
             <w:vAlign w:val="center"/>
+            <w:shd w:fill="F3F4F6"/>
           </w:tcPr>
           <w:p>
             <w:pPr>
@@ -106,6 +108,7 @@
               <w:end w:w="120" w:type="dxa"/>
             </w:tcMar>
             <w:vAlign w:val="center"/>
+            <w:shd w:fill="F3F4F6"/>
           </w:tcPr>
           <w:p>
             <w:pPr>
@@ -191,6 +194,7 @@
               <w:end w:w="120" w:type="dxa"/>
             </w:tcMar>
             <w:vAlign w:val="center"/>
+            <w:shd w:fill="F3F4F6"/>
           </w:tcPr>
           <w:p>
             <w:pPr>
@@ -218,6 +222,7 @@
               <w:end w:w="120" w:type="dxa"/>
             </w:tcMar>
             <w:vAlign w:val="center"/>
+            <w:shd w:fill="F3F4F6"/>
           </w:tcPr>
           <w:p>
             <w:pPr>
@@ -287,7 +292,7 @@
                 <w:color w:val="0F172A"/>
                 <w:sz w:val="19"/>
               </w:rPr>
-              <w:t>04/09/2026</w:t>
+              <w:t>25/09/2026</w:t>
             </w:r>
           </w:p>
         </w:tc>
@@ -303,6 +308,7 @@
               <w:end w:w="120" w:type="dxa"/>
             </w:tcMar>
             <w:vAlign w:val="center"/>
+            <w:shd w:fill="F3F4F6"/>
           </w:tcPr>
           <w:p>
             <w:pPr>
@@ -330,6 +336,7 @@
               <w:end w:w="120" w:type="dxa"/>
             </w:tcMar>
             <w:vAlign w:val="center"/>
+            <w:shd w:fill="F3F4F6"/>
           </w:tcPr>
           <w:p>
             <w:pPr>
@@ -396,7 +403,7 @@
         <w:rPr>
           <w:rFonts w:ascii="Calibri" w:hAnsi="Calibri"/>
           <w:b/>
-          <w:color w:val="2E74B5"/>
+          <w:color w:val="0F172A"/>
           <w:sz w:val="32"/>
         </w:rPr>
         <w:t>Resumo</w:t>
@@ -429,7 +436,7 @@
           <w:color w:val="0F172A"/>
           <w:sz w:val="22"/>
         </w:rPr>
-        <w:t>A documentacao descreve os objetivos do projeto, sua arquitetura, modelo de dados, fluxos de usuario, requisitos funcionais e nao funcionais, estrategias de seguranca, rotas principais, procedimentos de implantacao e pontos de manutencao. Tambem registra correcoes recentes realizadas para estabilizar a geracao de provas e a prova ao vivo.</w:t>
+        <w:t>A documentação descreve objetivos, requisitos, arquitetura, dados, fluxos de usuário, segurança, testes, operação e manutenção. Também estabelece critérios de qualidade e rastreabilidade para que a solução possa ser apresentada, implantada e evoluída de forma segura.</w:t>
       </w:r>
     </w:p>
     <w:p>
@@ -441,7 +448,7 @@
         <w:rPr>
           <w:rFonts w:ascii="Calibri" w:hAnsi="Calibri"/>
           <w:b/>
-          <w:color w:val="2E74B5"/>
+          <w:color w:val="0F172A"/>
           <w:sz w:val="26"/>
         </w:rPr>
         <w:t>Palavras-chave</w:t>
@@ -476,7 +483,7 @@
         <w:rPr>
           <w:rFonts w:ascii="Calibri" w:hAnsi="Calibri"/>
           <w:b/>
-          <w:color w:val="2E74B5"/>
+          <w:color w:val="0F172A"/>
           <w:sz w:val="32"/>
         </w:rPr>
         <w:t>Sumario</w:t>
@@ -614,7 +621,7 @@
           <w:color w:val="0F172A"/>
           <w:sz w:val="22"/>
         </w:rPr>
-        <w:t>9. Seguranca, privacidade e integridade</w:t>
+        <w:t>9. Segurança, privacidade e integridade</w:t>
       </w:r>
     </w:p>
     <w:p>
@@ -629,7 +636,7 @@
           <w:color w:val="0F172A"/>
           <w:sz w:val="22"/>
         </w:rPr>
-        <w:t>10. Testes e validacao</w:t>
+        <w:t>10. Requisitos e regras de negócio</w:t>
       </w:r>
     </w:p>
     <w:p>
@@ -644,7 +651,7 @@
           <w:color w:val="0F172A"/>
           <w:sz w:val="22"/>
         </w:rPr>
-        <w:t>11. Implantacao e operacao</w:t>
+        <w:t>11. Testes e validação</w:t>
       </w:r>
     </w:p>
     <w:p>
@@ -659,7 +666,7 @@
           <w:color w:val="0F172A"/>
           <w:sz w:val="22"/>
         </w:rPr>
-        <w:t>12. Manutencao evolutiva</w:t>
+        <w:t>12. Implantação e operação</w:t>
       </w:r>
     </w:p>
     <w:p>
@@ -674,7 +681,22 @@
           <w:color w:val="0F172A"/>
           <w:sz w:val="22"/>
         </w:rPr>
-        <w:t>13. Conclusao</w:t>
+        <w:t>13. Manutenção evolutiva</w:t>
+      </w:r>
+    </w:p>
+    <w:p>
+      <w:pPr>
+        <w:spacing w:after="60" w:line="264" w:lineRule="auto"/>
+      </w:pPr>
+      <w:r>
+        <w:rPr>
+          <w:rFonts w:ascii="Calibri" w:hAnsi="Calibri"/>
+          <w:b w:val="0"/>
+          <w:i w:val="0"/>
+          <w:color w:val="0F172A"/>
+          <w:sz w:val="22"/>
+        </w:rPr>
+        <w:t>14. Conclusão</w:t>
       </w:r>
     </w:p>
     <w:p>
@@ -706,7 +728,7 @@
         <w:rPr>
           <w:rFonts w:ascii="Calibri" w:hAnsi="Calibri"/>
           <w:b/>
-          <w:color w:val="2E74B5"/>
+          <w:color w:val="0F172A"/>
           <w:sz w:val="32"/>
         </w:rPr>
         <w:t>1. Introducao</w:t>
@@ -751,7 +773,7 @@
         <w:rPr>
           <w:rFonts w:ascii="Calibri" w:hAnsi="Calibri"/>
           <w:b/>
-          <w:color w:val="2E74B5"/>
+          <w:color w:val="0F172A"/>
           <w:sz w:val="32"/>
         </w:rPr>
         <w:t>2. Objetivos</w:t>
@@ -766,7 +788,7 @@
         <w:rPr>
           <w:rFonts w:ascii="Calibri" w:hAnsi="Calibri"/>
           <w:b/>
-          <w:color w:val="2E74B5"/>
+          <w:color w:val="0F172A"/>
           <w:sz w:val="26"/>
         </w:rPr>
         <w:t>2.1 Objetivo geral</w:t>
@@ -796,7 +818,7 @@
         <w:rPr>
           <w:rFonts w:ascii="Calibri" w:hAnsi="Calibri"/>
           <w:b/>
-          <w:color w:val="2E74B5"/>
+          <w:color w:val="0F172A"/>
           <w:sz w:val="26"/>
         </w:rPr>
         <w:t>2.2 Objetivos especificos</w:t>
@@ -909,7 +931,7 @@
         <w:rPr>
           <w:rFonts w:ascii="Calibri" w:hAnsi="Calibri"/>
           <w:b/>
-          <w:color w:val="2E74B5"/>
+          <w:color w:val="0F172A"/>
           <w:sz w:val="32"/>
         </w:rPr>
         <w:t>3. Justificativa</w:t>
@@ -930,67 +952,28 @@
         <w:t>Ferramentas educacionais eficientes precisam combinar usabilidade, rastreabilidade e rapidez. Em ambientes escolares, a aplicacao de provas digitais deve ser simples para o professor e objetiva para o aluno. O FormulaVest atende a esse cenario ao fornecer telas especializadas, dashboards e uma camada administrativa capaz de refletir a estrutura real da instituicao.</w:t>
       </w:r>
     </w:p>
-    <w:tbl>
-      <w:tblPr>
-        <w:tblW w:type="dxa" w:w="9360"/>
-        <w:jc w:val="center"/>
-        <w:tblLook w:firstColumn="1" w:firstRow="1" w:lastColumn="0" w:lastRow="0" w:noHBand="0" w:noVBand="1" w:val="04A0"/>
-        <w:tblBorders>
-          <w:top w:val="single" w:sz="6" w:space="0" w:color="B7C7DA"/>
-          <w:left w:val="single" w:sz="6" w:space="0" w:color="B7C7DA"/>
-          <w:bottom w:val="single" w:sz="6" w:space="0" w:color="B7C7DA"/>
-          <w:right w:val="single" w:sz="6" w:space="0" w:color="B7C7DA"/>
-          <w:insideH w:val="single" w:sz="6" w:space="0" w:color="B7C7DA"/>
-          <w:insideV w:val="single" w:sz="6" w:space="0" w:color="B7C7DA"/>
-        </w:tblBorders>
-      </w:tblPr>
-      <w:tblGrid>
-        <w:gridCol w:w="9360"/>
-      </w:tblGrid>
-      <w:tr>
-        <w:tc>
-          <w:tcPr>
-            <w:tcW w:type="dxa" w:w="9360"/>
-            <w:tcMar>
-              <w:top w:w="80" w:type="dxa"/>
-              <w:start w:w="120" w:type="dxa"/>
-              <w:bottom w:w="80" w:type="dxa"/>
-              <w:end w:w="120" w:type="dxa"/>
-            </w:tcMar>
-            <w:vAlign w:val="center"/>
-            <w:shd w:fill="F4F6F9"/>
-          </w:tcPr>
-          <w:p>
-            <w:pPr>
-              <w:spacing w:after="60"/>
-            </w:pPr>
-            <w:r>
-              <w:rPr>
-                <w:rFonts w:ascii="Calibri" w:hAnsi="Calibri"/>
-                <w:b/>
-                <w:color w:val="1F4D78"/>
-                <w:sz w:val="22"/>
-              </w:rPr>
-              <w:t>Contribuicao do projeto</w:t>
-            </w:r>
-          </w:p>
-          <w:p>
-            <w:pPr>
-              <w:spacing w:after="0"/>
-            </w:pPr>
-            <w:r>
-              <w:rPr>
-                <w:rFonts w:ascii="Calibri" w:hAnsi="Calibri"/>
-                <w:color w:val="0F172A"/>
-                <w:sz w:val="21"/>
-              </w:rPr>
-              <w:t>A principal contribuicao e integrar estudo individual, prova ao vivo e gestao escolar em uma mesma base de dados, reduzindo retrabalho e viabilizando analises posteriores de desempenho.</w:t>
-            </w:r>
-          </w:p>
-        </w:tc>
-      </w:tr>
-    </w:tbl>
-    <w:p/>
+    <w:p>
+      <w:pPr>
+        <w:spacing w:after="160" w:line="264" w:lineRule="auto"/>
+      </w:pPr>
+      <w:r>
+        <w:rPr>
+          <w:rFonts w:ascii="Calibri" w:hAnsi="Calibri"/>
+          <w:b/>
+          <w:color w:val="0F172A"/>
+          <w:sz w:val="22"/>
+        </w:rPr>
+        <w:t xml:space="preserve">Contribuicao do projeto. </w:t>
+      </w:r>
+      <w:r>
+        <w:rPr>
+          <w:rFonts w:ascii="Calibri" w:hAnsi="Calibri"/>
+          <w:color w:val="0F172A"/>
+          <w:sz w:val="22"/>
+        </w:rPr>
+        <w:t>A principal contribuição é integrar estudo individual, prova ao vivo e gestão escolar em uma mesma base de dados, reduzindo retrabalho e viabilizando análises posteriores de desempenho.</w:t>
+      </w:r>
+    </w:p>
     <w:p>
       <w:pPr>
         <w:pStyle w:val="Heading1"/>
@@ -1000,7 +983,7 @@
         <w:rPr>
           <w:rFonts w:ascii="Calibri" w:hAnsi="Calibri"/>
           <w:b/>
-          <w:color w:val="2E74B5"/>
+          <w:color w:val="0F172A"/>
           <w:sz w:val="32"/>
         </w:rPr>
         <w:t>4. Metodologia e tecnologias</w:t>
@@ -1051,7 +1034,7 @@
               <w:end w:w="120" w:type="dxa"/>
             </w:tcMar>
             <w:vAlign w:val="center"/>
-            <w:shd w:fill="F2F4F7"/>
+            <w:shd w:fill="1F2937"/>
           </w:tcPr>
           <w:p>
             <w:pPr>
@@ -1062,7 +1045,7 @@
               <w:rPr>
                 <w:rFonts w:ascii="Calibri" w:hAnsi="Calibri"/>
                 <w:b/>
-                <w:color w:val="0F172A"/>
+                <w:color w:val="FFFFFF"/>
                 <w:sz w:val="20"/>
               </w:rPr>
               <w:t>Camada</w:t>
@@ -1079,7 +1062,7 @@
               <w:end w:w="120" w:type="dxa"/>
             </w:tcMar>
             <w:vAlign w:val="center"/>
-            <w:shd w:fill="F2F4F7"/>
+            <w:shd w:fill="1F2937"/>
           </w:tcPr>
           <w:p>
             <w:pPr>
@@ -1090,7 +1073,7 @@
               <w:rPr>
                 <w:rFonts w:ascii="Calibri" w:hAnsi="Calibri"/>
                 <w:b/>
-                <w:color w:val="0F172A"/>
+                <w:color w:val="FFFFFF"/>
                 <w:sz w:val="20"/>
               </w:rPr>
               <w:t>Tecnologia</w:t>
@@ -1107,7 +1090,7 @@
               <w:end w:w="120" w:type="dxa"/>
             </w:tcMar>
             <w:vAlign w:val="center"/>
-            <w:shd w:fill="F2F4F7"/>
+            <w:shd w:fill="1F2937"/>
           </w:tcPr>
           <w:p>
             <w:pPr>
@@ -1118,7 +1101,7 @@
               <w:rPr>
                 <w:rFonts w:ascii="Calibri" w:hAnsi="Calibri"/>
                 <w:b/>
-                <w:color w:val="0F172A"/>
+                <w:color w:val="FFFFFF"/>
                 <w:sz w:val="20"/>
               </w:rPr>
               <w:t>Responsabilidade</w:t>
@@ -1220,6 +1203,7 @@
               <w:end w:w="120" w:type="dxa"/>
             </w:tcMar>
             <w:vAlign w:val="center"/>
+            <w:shd w:fill="F3F4F6"/>
           </w:tcPr>
           <w:p>
             <w:pPr>
@@ -1247,6 +1231,7 @@
               <w:end w:w="120" w:type="dxa"/>
             </w:tcMar>
             <w:vAlign w:val="center"/>
+            <w:shd w:fill="F3F4F6"/>
           </w:tcPr>
           <w:p>
             <w:pPr>
@@ -1274,6 +1259,7 @@
               <w:end w:w="120" w:type="dxa"/>
             </w:tcMar>
             <w:vAlign w:val="center"/>
+            <w:shd w:fill="F3F4F6"/>
           </w:tcPr>
           <w:p>
             <w:pPr>
@@ -1386,6 +1372,7 @@
               <w:end w:w="120" w:type="dxa"/>
             </w:tcMar>
             <w:vAlign w:val="center"/>
+            <w:shd w:fill="F3F4F6"/>
           </w:tcPr>
           <w:p>
             <w:pPr>
@@ -1413,6 +1400,7 @@
               <w:end w:w="120" w:type="dxa"/>
             </w:tcMar>
             <w:vAlign w:val="center"/>
+            <w:shd w:fill="F3F4F6"/>
           </w:tcPr>
           <w:p>
             <w:pPr>
@@ -1440,6 +1428,7 @@
               <w:end w:w="120" w:type="dxa"/>
             </w:tcMar>
             <w:vAlign w:val="center"/>
+            <w:shd w:fill="F3F4F6"/>
           </w:tcPr>
           <w:p>
             <w:pPr>
@@ -1552,6 +1541,7 @@
               <w:end w:w="120" w:type="dxa"/>
             </w:tcMar>
             <w:vAlign w:val="center"/>
+            <w:shd w:fill="F3F4F6"/>
           </w:tcPr>
           <w:p>
             <w:pPr>
@@ -1579,6 +1569,7 @@
               <w:end w:w="120" w:type="dxa"/>
             </w:tcMar>
             <w:vAlign w:val="center"/>
+            <w:shd w:fill="F3F4F6"/>
           </w:tcPr>
           <w:p>
             <w:pPr>
@@ -1606,6 +1597,7 @@
               <w:end w:w="120" w:type="dxa"/>
             </w:tcMar>
             <w:vAlign w:val="center"/>
+            <w:shd w:fill="F3F4F6"/>
           </w:tcPr>
           <w:p>
             <w:pPr>
@@ -1635,7 +1627,7 @@
         <w:rPr>
           <w:rFonts w:ascii="Calibri" w:hAnsi="Calibri"/>
           <w:b/>
-          <w:color w:val="2E74B5"/>
+          <w:color w:val="0F172A"/>
           <w:sz w:val="32"/>
         </w:rPr>
         <w:t>5. Arquitetura do sistema</w:t>
@@ -1685,7 +1677,7 @@
               <w:end w:w="120" w:type="dxa"/>
             </w:tcMar>
             <w:vAlign w:val="center"/>
-            <w:shd w:fill="F2F4F7"/>
+            <w:shd w:fill="1F2937"/>
           </w:tcPr>
           <w:p>
             <w:pPr>
@@ -1696,7 +1688,7 @@
               <w:rPr>
                 <w:rFonts w:ascii="Calibri" w:hAnsi="Calibri"/>
                 <w:b/>
-                <w:color w:val="0F172A"/>
+                <w:color w:val="FFFFFF"/>
                 <w:sz w:val="20"/>
               </w:rPr>
               <w:t>Modulo</w:t>
@@ -1713,7 +1705,7 @@
               <w:end w:w="120" w:type="dxa"/>
             </w:tcMar>
             <w:vAlign w:val="center"/>
-            <w:shd w:fill="F2F4F7"/>
+            <w:shd w:fill="1F2937"/>
           </w:tcPr>
           <w:p>
             <w:pPr>
@@ -1724,7 +1716,7 @@
               <w:rPr>
                 <w:rFonts w:ascii="Calibri" w:hAnsi="Calibri"/>
                 <w:b/>
-                <w:color w:val="0F172A"/>
+                <w:color w:val="FFFFFF"/>
                 <w:sz w:val="20"/>
               </w:rPr>
               <w:t>Descricao</w:t>
@@ -1799,6 +1791,7 @@
               <w:end w:w="120" w:type="dxa"/>
             </w:tcMar>
             <w:vAlign w:val="center"/>
+            <w:shd w:fill="F3F4F6"/>
           </w:tcPr>
           <w:p>
             <w:pPr>
@@ -1826,6 +1819,7 @@
               <w:end w:w="120" w:type="dxa"/>
             </w:tcMar>
             <w:vAlign w:val="center"/>
+            <w:shd w:fill="F3F4F6"/>
           </w:tcPr>
           <w:p>
             <w:pPr>
@@ -1911,6 +1905,7 @@
               <w:end w:w="120" w:type="dxa"/>
             </w:tcMar>
             <w:vAlign w:val="center"/>
+            <w:shd w:fill="F3F4F6"/>
           </w:tcPr>
           <w:p>
             <w:pPr>
@@ -1938,6 +1933,7 @@
               <w:end w:w="120" w:type="dxa"/>
             </w:tcMar>
             <w:vAlign w:val="center"/>
+            <w:shd w:fill="F3F4F6"/>
           </w:tcPr>
           <w:p>
             <w:pPr>
@@ -2023,6 +2019,7 @@
               <w:end w:w="120" w:type="dxa"/>
             </w:tcMar>
             <w:vAlign w:val="center"/>
+            <w:shd w:fill="F3F4F6"/>
           </w:tcPr>
           <w:p>
             <w:pPr>
@@ -2050,6 +2047,7 @@
               <w:end w:w="120" w:type="dxa"/>
             </w:tcMar>
             <w:vAlign w:val="center"/>
+            <w:shd w:fill="F3F4F6"/>
           </w:tcPr>
           <w:p>
             <w:pPr>
@@ -2135,6 +2133,7 @@
               <w:end w:w="120" w:type="dxa"/>
             </w:tcMar>
             <w:vAlign w:val="center"/>
+            <w:shd w:fill="F3F4F6"/>
           </w:tcPr>
           <w:p>
             <w:pPr>
@@ -2162,6 +2161,7 @@
               <w:end w:w="120" w:type="dxa"/>
             </w:tcMar>
             <w:vAlign w:val="center"/>
+            <w:shd w:fill="F3F4F6"/>
           </w:tcPr>
           <w:p>
             <w:pPr>
@@ -2182,67 +2182,28 @@
       </w:tr>
     </w:tbl>
     <w:p/>
-    <w:tbl>
-      <w:tblPr>
-        <w:tblW w:type="dxa" w:w="9360"/>
-        <w:jc w:val="center"/>
-        <w:tblLook w:firstColumn="1" w:firstRow="1" w:lastColumn="0" w:lastRow="0" w:noHBand="0" w:noVBand="1" w:val="04A0"/>
-        <w:tblBorders>
-          <w:top w:val="single" w:sz="6" w:space="0" w:color="B7C7DA"/>
-          <w:left w:val="single" w:sz="6" w:space="0" w:color="B7C7DA"/>
-          <w:bottom w:val="single" w:sz="6" w:space="0" w:color="B7C7DA"/>
-          <w:right w:val="single" w:sz="6" w:space="0" w:color="B7C7DA"/>
-          <w:insideH w:val="single" w:sz="6" w:space="0" w:color="B7C7DA"/>
-          <w:insideV w:val="single" w:sz="6" w:space="0" w:color="B7C7DA"/>
-        </w:tblBorders>
-      </w:tblPr>
-      <w:tblGrid>
-        <w:gridCol w:w="9360"/>
-      </w:tblGrid>
-      <w:tr>
-        <w:tc>
-          <w:tcPr>
-            <w:tcW w:type="dxa" w:w="9360"/>
-            <w:tcMar>
-              <w:top w:w="80" w:type="dxa"/>
-              <w:start w:w="120" w:type="dxa"/>
-              <w:bottom w:w="80" w:type="dxa"/>
-              <w:end w:w="120" w:type="dxa"/>
-            </w:tcMar>
-            <w:vAlign w:val="center"/>
-            <w:shd w:fill="F4F6F9"/>
-          </w:tcPr>
-          <w:p>
-            <w:pPr>
-              <w:spacing w:after="60"/>
-            </w:pPr>
-            <w:r>
-              <w:rPr>
-                <w:rFonts w:ascii="Calibri" w:hAnsi="Calibri"/>
-                <w:b/>
-                <w:color w:val="1F4D78"/>
-                <w:sz w:val="22"/>
-              </w:rPr>
-              <w:t>Fluxo macro</w:t>
-            </w:r>
-          </w:p>
-          <w:p>
-            <w:pPr>
-              <w:spacing w:after="0"/>
-            </w:pPr>
-            <w:r>
-              <w:rPr>
-                <w:rFonts w:ascii="Calibri" w:hAnsi="Calibri"/>
-                <w:color w:val="0F172A"/>
-                <w:sz w:val="21"/>
-              </w:rPr>
-              <w:t>Navegador -&gt; arquivos public/ -&gt; fetch para rotas Express -&gt; validacao JWT -&gt; regras de permissao -&gt; consultas PostgreSQL -&gt; resposta JSON ou arquivo exportado.</w:t>
-            </w:r>
-          </w:p>
-        </w:tc>
-      </w:tr>
-    </w:tbl>
-    <w:p/>
+    <w:p>
+      <w:pPr>
+        <w:spacing w:after="160" w:line="264" w:lineRule="auto"/>
+      </w:pPr>
+      <w:r>
+        <w:rPr>
+          <w:rFonts w:ascii="Calibri" w:hAnsi="Calibri"/>
+          <w:b/>
+          <w:color w:val="0F172A"/>
+          <w:sz w:val="22"/>
+        </w:rPr>
+        <w:t xml:space="preserve">Fluxo macro. </w:t>
+      </w:r>
+      <w:r>
+        <w:rPr>
+          <w:rFonts w:ascii="Calibri" w:hAnsi="Calibri"/>
+          <w:color w:val="0F172A"/>
+          <w:sz w:val="22"/>
+        </w:rPr>
+        <w:t>Navegador -&gt; arquivos public/ -&gt; fetch para rotas Express -&gt; validacao JWT -&gt; regras de permissao -&gt; consultas PostgreSQL -&gt; resposta JSON ou arquivo exportado.</w:t>
+      </w:r>
+    </w:p>
     <w:p>
       <w:pPr>
         <w:pStyle w:val="Heading1"/>
@@ -2252,7 +2213,7 @@
         <w:rPr>
           <w:rFonts w:ascii="Calibri" w:hAnsi="Calibri"/>
           <w:b/>
-          <w:color w:val="2E74B5"/>
+          <w:color w:val="0F172A"/>
           <w:sz w:val="32"/>
         </w:rPr>
         <w:t>6. Modelo de dados</w:t>
@@ -2302,7 +2263,7 @@
               <w:end w:w="120" w:type="dxa"/>
             </w:tcMar>
             <w:vAlign w:val="center"/>
-            <w:shd w:fill="F2F4F7"/>
+            <w:shd w:fill="1F2937"/>
           </w:tcPr>
           <w:p>
             <w:pPr>
@@ -2313,7 +2274,7 @@
               <w:rPr>
                 <w:rFonts w:ascii="Calibri" w:hAnsi="Calibri"/>
                 <w:b/>
-                <w:color w:val="0F172A"/>
+                <w:color w:val="FFFFFF"/>
                 <w:sz w:val="20"/>
               </w:rPr>
               <w:t>Tabela</w:t>
@@ -2330,7 +2291,7 @@
               <w:end w:w="120" w:type="dxa"/>
             </w:tcMar>
             <w:vAlign w:val="center"/>
-            <w:shd w:fill="F2F4F7"/>
+            <w:shd w:fill="1F2937"/>
           </w:tcPr>
           <w:p>
             <w:pPr>
@@ -2341,7 +2302,7 @@
               <w:rPr>
                 <w:rFonts w:ascii="Calibri" w:hAnsi="Calibri"/>
                 <w:b/>
-                <w:color w:val="0F172A"/>
+                <w:color w:val="FFFFFF"/>
                 <w:sz w:val="20"/>
               </w:rPr>
               <w:t>Finalidade principal</w:t>
@@ -2416,6 +2377,7 @@
               <w:end w:w="120" w:type="dxa"/>
             </w:tcMar>
             <w:vAlign w:val="center"/>
+            <w:shd w:fill="F3F4F6"/>
           </w:tcPr>
           <w:p>
             <w:pPr>
@@ -2443,6 +2405,7 @@
               <w:end w:w="120" w:type="dxa"/>
             </w:tcMar>
             <w:vAlign w:val="center"/>
+            <w:shd w:fill="F3F4F6"/>
           </w:tcPr>
           <w:p>
             <w:pPr>
@@ -2528,6 +2491,7 @@
               <w:end w:w="120" w:type="dxa"/>
             </w:tcMar>
             <w:vAlign w:val="center"/>
+            <w:shd w:fill="F3F4F6"/>
           </w:tcPr>
           <w:p>
             <w:pPr>
@@ -2555,6 +2519,7 @@
               <w:end w:w="120" w:type="dxa"/>
             </w:tcMar>
             <w:vAlign w:val="center"/>
+            <w:shd w:fill="F3F4F6"/>
           </w:tcPr>
           <w:p>
             <w:pPr>
@@ -2640,6 +2605,7 @@
               <w:end w:w="120" w:type="dxa"/>
             </w:tcMar>
             <w:vAlign w:val="center"/>
+            <w:shd w:fill="F3F4F6"/>
           </w:tcPr>
           <w:p>
             <w:pPr>
@@ -2667,6 +2633,7 @@
               <w:end w:w="120" w:type="dxa"/>
             </w:tcMar>
             <w:vAlign w:val="center"/>
+            <w:shd w:fill="F3F4F6"/>
           </w:tcPr>
           <w:p>
             <w:pPr>
@@ -2752,6 +2719,7 @@
               <w:end w:w="120" w:type="dxa"/>
             </w:tcMar>
             <w:vAlign w:val="center"/>
+            <w:shd w:fill="F3F4F6"/>
           </w:tcPr>
           <w:p>
             <w:pPr>
@@ -2779,6 +2747,7 @@
               <w:end w:w="120" w:type="dxa"/>
             </w:tcMar>
             <w:vAlign w:val="center"/>
+            <w:shd w:fill="F3F4F6"/>
           </w:tcPr>
           <w:p>
             <w:pPr>
@@ -2864,6 +2833,7 @@
               <w:end w:w="120" w:type="dxa"/>
             </w:tcMar>
             <w:vAlign w:val="center"/>
+            <w:shd w:fill="F3F4F6"/>
           </w:tcPr>
           <w:p>
             <w:pPr>
@@ -2891,6 +2861,7 @@
               <w:end w:w="120" w:type="dxa"/>
             </w:tcMar>
             <w:vAlign w:val="center"/>
+            <w:shd w:fill="F3F4F6"/>
           </w:tcPr>
           <w:p>
             <w:pPr>
@@ -2976,6 +2947,7 @@
               <w:end w:w="120" w:type="dxa"/>
             </w:tcMar>
             <w:vAlign w:val="center"/>
+            <w:shd w:fill="F3F4F6"/>
           </w:tcPr>
           <w:p>
             <w:pPr>
@@ -3003,6 +2975,7 @@
               <w:end w:w="120" w:type="dxa"/>
             </w:tcMar>
             <w:vAlign w:val="center"/>
+            <w:shd w:fill="F3F4F6"/>
           </w:tcPr>
           <w:p>
             <w:pPr>
@@ -3032,7 +3005,7 @@
         <w:rPr>
           <w:rFonts w:ascii="Calibri" w:hAnsi="Calibri"/>
           <w:b/>
-          <w:color w:val="2E74B5"/>
+          <w:color w:val="0F172A"/>
           <w:sz w:val="26"/>
         </w:rPr>
         <w:t>6.1 Regras importantes de dados</w:t>
@@ -3117,7 +3090,7 @@
         <w:rPr>
           <w:rFonts w:ascii="Calibri" w:hAnsi="Calibri"/>
           <w:b/>
-          <w:color w:val="2E74B5"/>
+          <w:color w:val="0F172A"/>
           <w:sz w:val="32"/>
         </w:rPr>
         <w:t>7. Funcionalidades por perfil</w:t>
@@ -3152,7 +3125,7 @@
               <w:end w:w="120" w:type="dxa"/>
             </w:tcMar>
             <w:vAlign w:val="center"/>
-            <w:shd w:fill="F2F4F7"/>
+            <w:shd w:fill="1F2937"/>
           </w:tcPr>
           <w:p>
             <w:pPr>
@@ -3163,7 +3136,7 @@
               <w:rPr>
                 <w:rFonts w:ascii="Calibri" w:hAnsi="Calibri"/>
                 <w:b/>
-                <w:color w:val="0F172A"/>
+                <w:color w:val="FFFFFF"/>
                 <w:sz w:val="20"/>
               </w:rPr>
               <w:t>Perfil</w:t>
@@ -3180,7 +3153,7 @@
               <w:end w:w="120" w:type="dxa"/>
             </w:tcMar>
             <w:vAlign w:val="center"/>
-            <w:shd w:fill="F2F4F7"/>
+            <w:shd w:fill="1F2937"/>
           </w:tcPr>
           <w:p>
             <w:pPr>
@@ -3191,7 +3164,7 @@
               <w:rPr>
                 <w:rFonts w:ascii="Calibri" w:hAnsi="Calibri"/>
                 <w:b/>
-                <w:color w:val="0F172A"/>
+                <w:color w:val="FFFFFF"/>
                 <w:sz w:val="20"/>
               </w:rPr>
               <w:t>Funcionalidades</w:t>
@@ -3266,6 +3239,7 @@
               <w:end w:w="120" w:type="dxa"/>
             </w:tcMar>
             <w:vAlign w:val="center"/>
+            <w:shd w:fill="F3F4F6"/>
           </w:tcPr>
           <w:p>
             <w:pPr>
@@ -3293,6 +3267,7 @@
               <w:end w:w="120" w:type="dxa"/>
             </w:tcMar>
             <w:vAlign w:val="center"/>
+            <w:shd w:fill="F3F4F6"/>
           </w:tcPr>
           <w:p>
             <w:pPr>
@@ -3378,6 +3353,7 @@
               <w:end w:w="120" w:type="dxa"/>
             </w:tcMar>
             <w:vAlign w:val="center"/>
+            <w:shd w:fill="F3F4F6"/>
           </w:tcPr>
           <w:p>
             <w:pPr>
@@ -3405,6 +3381,7 @@
               <w:end w:w="120" w:type="dxa"/>
             </w:tcMar>
             <w:vAlign w:val="center"/>
+            <w:shd w:fill="F3F4F6"/>
           </w:tcPr>
           <w:p>
             <w:pPr>
@@ -3483,6 +3460,483 @@
     <w:p/>
     <w:p>
       <w:pPr>
+        <w:pStyle w:val="Heading2"/>
+        <w:spacing w:before="240" w:after="120"/>
+      </w:pPr>
+      <w:r>
+        <w:rPr>
+          <w:rFonts w:ascii="Calibri" w:hAnsi="Calibri"/>
+          <w:b/>
+          <w:color w:val="0F172A"/>
+          <w:sz w:val="26"/>
+        </w:rPr>
+        <w:t>7.1 Experiência do aluno e indicadores</w:t>
+      </w:r>
+    </w:p>
+    <w:p>
+      <w:pPr>
+        <w:spacing w:after="120" w:line="264" w:lineRule="auto"/>
+      </w:pPr>
+      <w:r>
+        <w:rPr>
+          <w:rFonts w:ascii="Calibri" w:hAnsi="Calibri"/>
+          <w:b w:val="0"/>
+          <w:i w:val="0"/>
+          <w:color w:val="0F172A"/>
+          <w:sz w:val="22"/>
+        </w:rPr>
+        <w:t>Após concluir uma prova, o aluno recebe uma tela de resultado com nota, total de acertos, percentual, tempo empregado, XP recebido e evolução de nível. O painel de estatísticas consolida histórico de tentativas, gráfico de desempenho e comparação por matéria. Esses elementos transformam a correção em uma devolutiva pedagógica clara, e não apenas em uma nota isolada.</w:t>
+      </w:r>
+    </w:p>
+    <w:tbl>
+      <w:tblPr>
+        <w:tblW w:type="dxa" w:w="9360"/>
+        <w:jc w:val="center"/>
+        <w:tblLook w:firstColumn="1" w:firstRow="1" w:lastColumn="0" w:lastRow="0" w:noHBand="0" w:noVBand="1" w:val="04A0"/>
+        <w:tblBorders>
+          <w:top w:val="single" w:sz="6" w:space="0" w:color="D7DBE2"/>
+          <w:left w:val="single" w:sz="6" w:space="0" w:color="D7DBE2"/>
+          <w:bottom w:val="single" w:sz="6" w:space="0" w:color="D7DBE2"/>
+          <w:right w:val="single" w:sz="6" w:space="0" w:color="D7DBE2"/>
+          <w:insideH w:val="single" w:sz="6" w:space="0" w:color="D7DBE2"/>
+          <w:insideV w:val="single" w:sz="6" w:space="0" w:color="D7DBE2"/>
+        </w:tblBorders>
+      </w:tblPr>
+      <w:tblGrid>
+        <w:gridCol w:w="2800"/>
+        <w:gridCol w:w="6560"/>
+      </w:tblGrid>
+      <w:tr>
+        <w:tc>
+          <w:tcPr>
+            <w:tcW w:type="dxa" w:w="2800"/>
+            <w:tcMar>
+              <w:top w:w="80" w:type="dxa"/>
+              <w:start w:w="120" w:type="dxa"/>
+              <w:bottom w:w="80" w:type="dxa"/>
+              <w:end w:w="120" w:type="dxa"/>
+            </w:tcMar>
+            <w:vAlign w:val="center"/>
+            <w:shd w:fill="1F2937"/>
+          </w:tcPr>
+          <w:p>
+            <w:pPr>
+              <w:spacing w:after="0"/>
+            </w:pPr>
+            <w:r/>
+            <w:r>
+              <w:rPr>
+                <w:rFonts w:ascii="Calibri" w:hAnsi="Calibri"/>
+                <w:b/>
+                <w:color w:val="FFFFFF"/>
+                <w:sz w:val="20"/>
+              </w:rPr>
+              <w:t>Indicador</w:t>
+            </w:r>
+          </w:p>
+        </w:tc>
+        <w:tc>
+          <w:tcPr>
+            <w:tcW w:type="dxa" w:w="6560"/>
+            <w:tcMar>
+              <w:top w:w="80" w:type="dxa"/>
+              <w:start w:w="120" w:type="dxa"/>
+              <w:bottom w:w="80" w:type="dxa"/>
+              <w:end w:w="120" w:type="dxa"/>
+            </w:tcMar>
+            <w:vAlign w:val="center"/>
+            <w:shd w:fill="1F2937"/>
+          </w:tcPr>
+          <w:p>
+            <w:pPr>
+              <w:spacing w:after="0"/>
+            </w:pPr>
+            <w:r/>
+            <w:r>
+              <w:rPr>
+                <w:rFonts w:ascii="Calibri" w:hAnsi="Calibri"/>
+                <w:b/>
+                <w:color w:val="FFFFFF"/>
+                <w:sz w:val="20"/>
+              </w:rPr>
+              <w:t>Uso pedagógico</w:t>
+            </w:r>
+          </w:p>
+        </w:tc>
+      </w:tr>
+      <w:tr>
+        <w:tc>
+          <w:tcPr>
+            <w:tcW w:type="dxa" w:w="2800"/>
+            <w:tcMar>
+              <w:top w:w="80" w:type="dxa"/>
+              <w:start w:w="120" w:type="dxa"/>
+              <w:bottom w:w="80" w:type="dxa"/>
+              <w:end w:w="120" w:type="dxa"/>
+            </w:tcMar>
+            <w:vAlign w:val="center"/>
+          </w:tcPr>
+          <w:p>
+            <w:pPr>
+              <w:spacing w:after="0"/>
+            </w:pPr>
+            <w:r/>
+            <w:r>
+              <w:rPr>
+                <w:rFonts w:ascii="Calibri" w:hAnsi="Calibri"/>
+                <w:b w:val="0"/>
+                <w:color w:val="0F172A"/>
+                <w:sz w:val="19"/>
+              </w:rPr>
+              <w:t>Acertos e percentual</w:t>
+            </w:r>
+          </w:p>
+        </w:tc>
+        <w:tc>
+          <w:tcPr>
+            <w:tcW w:type="dxa" w:w="6560"/>
+            <w:tcMar>
+              <w:top w:w="80" w:type="dxa"/>
+              <w:start w:w="120" w:type="dxa"/>
+              <w:bottom w:w="80" w:type="dxa"/>
+              <w:end w:w="120" w:type="dxa"/>
+            </w:tcMar>
+            <w:vAlign w:val="center"/>
+          </w:tcPr>
+          <w:p>
+            <w:pPr>
+              <w:spacing w:after="0"/>
+            </w:pPr>
+            <w:r/>
+            <w:r>
+              <w:rPr>
+                <w:rFonts w:ascii="Calibri" w:hAnsi="Calibri"/>
+                <w:b w:val="0"/>
+                <w:color w:val="0F172A"/>
+                <w:sz w:val="19"/>
+              </w:rPr>
+              <w:t>Permite identificar domínio global da prova.</w:t>
+            </w:r>
+          </w:p>
+        </w:tc>
+      </w:tr>
+      <w:tr>
+        <w:tc>
+          <w:tcPr>
+            <w:tcW w:type="dxa" w:w="2800"/>
+            <w:tcMar>
+              <w:top w:w="80" w:type="dxa"/>
+              <w:start w:w="120" w:type="dxa"/>
+              <w:bottom w:w="80" w:type="dxa"/>
+              <w:end w:w="120" w:type="dxa"/>
+            </w:tcMar>
+            <w:vAlign w:val="center"/>
+            <w:shd w:fill="F3F4F6"/>
+          </w:tcPr>
+          <w:p>
+            <w:pPr>
+              <w:spacing w:after="0"/>
+            </w:pPr>
+            <w:r/>
+            <w:r>
+              <w:rPr>
+                <w:rFonts w:ascii="Calibri" w:hAnsi="Calibri"/>
+                <w:b w:val="0"/>
+                <w:color w:val="0F172A"/>
+                <w:sz w:val="19"/>
+              </w:rPr>
+              <w:t>Desempenho por matéria</w:t>
+            </w:r>
+          </w:p>
+        </w:tc>
+        <w:tc>
+          <w:tcPr>
+            <w:tcW w:type="dxa" w:w="6560"/>
+            <w:tcMar>
+              <w:top w:w="80" w:type="dxa"/>
+              <w:start w:w="120" w:type="dxa"/>
+              <w:bottom w:w="80" w:type="dxa"/>
+              <w:end w:w="120" w:type="dxa"/>
+            </w:tcMar>
+            <w:vAlign w:val="center"/>
+            <w:shd w:fill="F3F4F6"/>
+          </w:tcPr>
+          <w:p>
+            <w:pPr>
+              <w:spacing w:after="0"/>
+            </w:pPr>
+            <w:r/>
+            <w:r>
+              <w:rPr>
+                <w:rFonts w:ascii="Calibri" w:hAnsi="Calibri"/>
+                <w:b w:val="0"/>
+                <w:color w:val="0F172A"/>
+                <w:sz w:val="19"/>
+              </w:rPr>
+              <w:t>Orienta revisão focada em áreas com menor aproveitamento.</w:t>
+            </w:r>
+          </w:p>
+        </w:tc>
+      </w:tr>
+      <w:tr>
+        <w:tc>
+          <w:tcPr>
+            <w:tcW w:type="dxa" w:w="2800"/>
+            <w:tcMar>
+              <w:top w:w="80" w:type="dxa"/>
+              <w:start w:w="120" w:type="dxa"/>
+              <w:bottom w:w="80" w:type="dxa"/>
+              <w:end w:w="120" w:type="dxa"/>
+            </w:tcMar>
+            <w:vAlign w:val="center"/>
+          </w:tcPr>
+          <w:p>
+            <w:pPr>
+              <w:spacing w:after="0"/>
+            </w:pPr>
+            <w:r/>
+            <w:r>
+              <w:rPr>
+                <w:rFonts w:ascii="Calibri" w:hAnsi="Calibri"/>
+                <w:b w:val="0"/>
+                <w:color w:val="0F172A"/>
+                <w:sz w:val="19"/>
+              </w:rPr>
+              <w:t>XP e nível</w:t>
+            </w:r>
+          </w:p>
+        </w:tc>
+        <w:tc>
+          <w:tcPr>
+            <w:tcW w:type="dxa" w:w="6560"/>
+            <w:tcMar>
+              <w:top w:w="80" w:type="dxa"/>
+              <w:start w:w="120" w:type="dxa"/>
+              <w:bottom w:w="80" w:type="dxa"/>
+              <w:end w:w="120" w:type="dxa"/>
+            </w:tcMar>
+            <w:vAlign w:val="center"/>
+          </w:tcPr>
+          <w:p>
+            <w:pPr>
+              <w:spacing w:after="0"/>
+            </w:pPr>
+            <w:r/>
+            <w:r>
+              <w:rPr>
+                <w:rFonts w:ascii="Calibri" w:hAnsi="Calibri"/>
+                <w:b w:val="0"/>
+                <w:color w:val="0F172A"/>
+                <w:sz w:val="19"/>
+              </w:rPr>
+              <w:t>Dá retorno imediato de progresso e incentiva recorrência.</w:t>
+            </w:r>
+          </w:p>
+        </w:tc>
+      </w:tr>
+      <w:tr>
+        <w:tc>
+          <w:tcPr>
+            <w:tcW w:type="dxa" w:w="2800"/>
+            <w:tcMar>
+              <w:top w:w="80" w:type="dxa"/>
+              <w:start w:w="120" w:type="dxa"/>
+              <w:bottom w:w="80" w:type="dxa"/>
+              <w:end w:w="120" w:type="dxa"/>
+            </w:tcMar>
+            <w:vAlign w:val="center"/>
+            <w:shd w:fill="F3F4F6"/>
+          </w:tcPr>
+          <w:p>
+            <w:pPr>
+              <w:spacing w:after="0"/>
+            </w:pPr>
+            <w:r/>
+            <w:r>
+              <w:rPr>
+                <w:rFonts w:ascii="Calibri" w:hAnsi="Calibri"/>
+                <w:b w:val="0"/>
+                <w:color w:val="0F172A"/>
+                <w:sz w:val="19"/>
+              </w:rPr>
+              <w:t>Ranking</w:t>
+            </w:r>
+          </w:p>
+        </w:tc>
+        <w:tc>
+          <w:tcPr>
+            <w:tcW w:type="dxa" w:w="6560"/>
+            <w:tcMar>
+              <w:top w:w="80" w:type="dxa"/>
+              <w:start w:w="120" w:type="dxa"/>
+              <w:bottom w:w="80" w:type="dxa"/>
+              <w:end w:w="120" w:type="dxa"/>
+            </w:tcMar>
+            <w:vAlign w:val="center"/>
+            <w:shd w:fill="F3F4F6"/>
+          </w:tcPr>
+          <w:p>
+            <w:pPr>
+              <w:spacing w:after="0"/>
+            </w:pPr>
+            <w:r/>
+            <w:r>
+              <w:rPr>
+                <w:rFonts w:ascii="Calibri" w:hAnsi="Calibri"/>
+                <w:b w:val="0"/>
+                <w:color w:val="0F172A"/>
+                <w:sz w:val="19"/>
+              </w:rPr>
+              <w:t>Cria comparação opcional e motivação em contexto de turma.</w:t>
+            </w:r>
+          </w:p>
+        </w:tc>
+      </w:tr>
+      <w:tr>
+        <w:tc>
+          <w:tcPr>
+            <w:tcW w:type="dxa" w:w="2800"/>
+            <w:tcMar>
+              <w:top w:w="80" w:type="dxa"/>
+              <w:start w:w="120" w:type="dxa"/>
+              <w:bottom w:w="80" w:type="dxa"/>
+              <w:end w:w="120" w:type="dxa"/>
+            </w:tcMar>
+            <w:vAlign w:val="center"/>
+          </w:tcPr>
+          <w:p>
+            <w:pPr>
+              <w:spacing w:after="0"/>
+            </w:pPr>
+            <w:r/>
+            <w:r>
+              <w:rPr>
+                <w:rFonts w:ascii="Calibri" w:hAnsi="Calibri"/>
+                <w:b w:val="0"/>
+                <w:color w:val="0F172A"/>
+                <w:sz w:val="19"/>
+              </w:rPr>
+              <w:t>Conquistas</w:t>
+            </w:r>
+          </w:p>
+        </w:tc>
+        <w:tc>
+          <w:tcPr>
+            <w:tcW w:type="dxa" w:w="6560"/>
+            <w:tcMar>
+              <w:top w:w="80" w:type="dxa"/>
+              <w:start w:w="120" w:type="dxa"/>
+              <w:bottom w:w="80" w:type="dxa"/>
+              <w:end w:w="120" w:type="dxa"/>
+            </w:tcMar>
+            <w:vAlign w:val="center"/>
+          </w:tcPr>
+          <w:p>
+            <w:pPr>
+              <w:spacing w:after="0"/>
+            </w:pPr>
+            <w:r/>
+            <w:r>
+              <w:rPr>
+                <w:rFonts w:ascii="Calibri" w:hAnsi="Calibri"/>
+                <w:b w:val="0"/>
+                <w:color w:val="0F172A"/>
+                <w:sz w:val="19"/>
+              </w:rPr>
+              <w:t>Reconhece marcos como primeira prova, sequência e evolução de nível.</w:t>
+            </w:r>
+          </w:p>
+        </w:tc>
+      </w:tr>
+    </w:tbl>
+    <w:p/>
+    <w:p>
+      <w:pPr>
+        <w:pStyle w:val="Heading2"/>
+        <w:spacing w:before="240" w:after="120"/>
+      </w:pPr>
+      <w:r>
+        <w:rPr>
+          <w:rFonts w:ascii="Calibri" w:hAnsi="Calibri"/>
+          <w:b/>
+          <w:color w:val="0F172A"/>
+          <w:sz w:val="26"/>
+        </w:rPr>
+        <w:t>7.2 Conquistas implementadas</w:t>
+      </w:r>
+    </w:p>
+    <w:p>
+      <w:pPr>
+        <w:pStyle w:val="ListBullet"/>
+        <w:spacing w:after="80" w:line="280" w:lineRule="auto"/>
+      </w:pPr>
+      <w:r>
+        <w:rPr>
+          <w:rFonts w:ascii="Calibri" w:hAnsi="Calibri"/>
+          <w:color w:val="0F172A"/>
+          <w:sz w:val="22"/>
+        </w:rPr>
+        <w:t>Primeira prova, três provas, dez provas e cinquenta provas concluídas.</w:t>
+      </w:r>
+    </w:p>
+    <w:p>
+      <w:pPr>
+        <w:pStyle w:val="ListBullet"/>
+        <w:spacing w:after="80" w:line="280" w:lineRule="auto"/>
+      </w:pPr>
+      <w:r>
+        <w:rPr>
+          <w:rFonts w:ascii="Calibri" w:hAnsi="Calibri"/>
+          <w:color w:val="0F172A"/>
+          <w:sz w:val="22"/>
+        </w:rPr>
+        <w:t>Prova perfeita, para aproveitamento total em uma tentativa finalizada.</w:t>
+      </w:r>
+    </w:p>
+    <w:p>
+      <w:pPr>
+        <w:pStyle w:val="ListBullet"/>
+        <w:spacing w:after="80" w:line="280" w:lineRule="auto"/>
+      </w:pPr>
+      <w:r>
+        <w:rPr>
+          <w:rFonts w:ascii="Calibri" w:hAnsi="Calibri"/>
+          <w:color w:val="0F172A"/>
+          <w:sz w:val="22"/>
+        </w:rPr>
+        <w:t>Marcos de XP e de nível, incluindo os patamares cinco e dez.</w:t>
+      </w:r>
+    </w:p>
+    <w:p>
+      <w:pPr>
+        <w:pStyle w:val="ListBullet"/>
+        <w:spacing w:after="80" w:line="280" w:lineRule="auto"/>
+      </w:pPr>
+      <w:r>
+        <w:rPr>
+          <w:rFonts w:ascii="Calibri" w:hAnsi="Calibri"/>
+          <w:color w:val="0F172A"/>
+          <w:sz w:val="22"/>
+        </w:rPr>
+        <w:t>Sequências de estudo de três e sete dias, calculadas a partir de tentativas finalizadas.</w:t>
+      </w:r>
+    </w:p>
+    <w:p>
+      <w:pPr>
+        <w:pStyle w:val="ListBullet"/>
+        <w:spacing w:after="80" w:line="280" w:lineRule="auto"/>
+      </w:pPr>
+      <w:r>
+        <w:rPr>
+          <w:rFonts w:ascii="Calibri" w:hAnsi="Calibri"/>
+          <w:color w:val="0F172A"/>
+          <w:sz w:val="22"/>
+        </w:rPr>
+        <w:t>Notificação não intrusiva no canto superior direito quando uma nova conquista é registrada.</w:t>
+      </w:r>
+    </w:p>
+    <w:p>
+      <w:pPr>
         <w:pStyle w:val="Heading1"/>
         <w:spacing w:before="320" w:after="160"/>
       </w:pPr>
@@ -3490,7 +3944,7 @@
         <w:rPr>
           <w:rFonts w:ascii="Calibri" w:hAnsi="Calibri"/>
           <w:b/>
-          <w:color w:val="2E74B5"/>
+          <w:color w:val="0F172A"/>
           <w:sz w:val="32"/>
         </w:rPr>
         <w:t>8. Fluxos principais</w:t>
@@ -3505,7 +3959,7 @@
         <w:rPr>
           <w:rFonts w:ascii="Calibri" w:hAnsi="Calibri"/>
           <w:b/>
-          <w:color w:val="2E74B5"/>
+          <w:color w:val="0F172A"/>
           <w:sz w:val="26"/>
         </w:rPr>
         <w:t>8.1 Geracao de simulado individual</w:t>
@@ -3590,7 +4044,7 @@
         <w:rPr>
           <w:rFonts w:ascii="Calibri" w:hAnsi="Calibri"/>
           <w:b/>
-          <w:color w:val="2E74B5"/>
+          <w:color w:val="0F172A"/>
           <w:sz w:val="26"/>
         </w:rPr>
         <w:t>8.2 Prova ao vivo</w:t>
@@ -3675,7 +4129,7 @@
         <w:rPr>
           <w:rFonts w:ascii="Calibri" w:hAnsi="Calibri"/>
           <w:b/>
-          <w:color w:val="2E74B5"/>
+          <w:color w:val="0F172A"/>
           <w:sz w:val="26"/>
         </w:rPr>
         <w:t>8.3 Administracao</w:t>
@@ -3746,7 +4200,7 @@
         <w:rPr>
           <w:rFonts w:ascii="Calibri" w:hAnsi="Calibri"/>
           <w:b/>
-          <w:color w:val="2E74B5"/>
+          <w:color w:val="0F172A"/>
           <w:sz w:val="32"/>
         </w:rPr>
         <w:t>9. Seguranca, privacidade e integridade</w:t>
@@ -3864,67 +4318,28 @@
         <w:t>Alunos banidos sao bloqueados no login.</w:t>
       </w:r>
     </w:p>
-    <w:tbl>
-      <w:tblPr>
-        <w:tblW w:type="dxa" w:w="9360"/>
-        <w:jc w:val="center"/>
-        <w:tblLook w:firstColumn="1" w:firstRow="1" w:lastColumn="0" w:lastRow="0" w:noHBand="0" w:noVBand="1" w:val="04A0"/>
-        <w:tblBorders>
-          <w:top w:val="single" w:sz="6" w:space="0" w:color="B7C7DA"/>
-          <w:left w:val="single" w:sz="6" w:space="0" w:color="B7C7DA"/>
-          <w:bottom w:val="single" w:sz="6" w:space="0" w:color="B7C7DA"/>
-          <w:right w:val="single" w:sz="6" w:space="0" w:color="B7C7DA"/>
-          <w:insideH w:val="single" w:sz="6" w:space="0" w:color="B7C7DA"/>
-          <w:insideV w:val="single" w:sz="6" w:space="0" w:color="B7C7DA"/>
-        </w:tblBorders>
-      </w:tblPr>
-      <w:tblGrid>
-        <w:gridCol w:w="9360"/>
-      </w:tblGrid>
-      <w:tr>
-        <w:tc>
-          <w:tcPr>
-            <w:tcW w:type="dxa" w:w="9360"/>
-            <w:tcMar>
-              <w:top w:w="80" w:type="dxa"/>
-              <w:start w:w="120" w:type="dxa"/>
-              <w:bottom w:w="80" w:type="dxa"/>
-              <w:end w:w="120" w:type="dxa"/>
-            </w:tcMar>
-            <w:vAlign w:val="center"/>
-            <w:shd w:fill="F4F6F9"/>
-          </w:tcPr>
-          <w:p>
-            <w:pPr>
-              <w:spacing w:after="60"/>
-            </w:pPr>
-            <w:r>
-              <w:rPr>
-                <w:rFonts w:ascii="Calibri" w:hAnsi="Calibri"/>
-                <w:b/>
-                <w:color w:val="1F4D78"/>
-                <w:sz w:val="22"/>
-              </w:rPr>
-              <w:t>Ponto de atencao</w:t>
-            </w:r>
-          </w:p>
-          <w:p>
-            <w:pPr>
-              <w:spacing w:after="0"/>
-            </w:pPr>
-            <w:r>
-              <w:rPr>
-                <w:rFonts w:ascii="Calibri" w:hAnsi="Calibri"/>
-                <w:color w:val="0F172A"/>
-                <w:sz w:val="21"/>
-              </w:rPr>
-              <w:t>A seguranca depende de JWT_SECRET forte, MASTER_PASSWORD seguro, uso de HTTPS em producao e controle adequado das variaveis .env.</w:t>
-            </w:r>
-          </w:p>
-        </w:tc>
-      </w:tr>
-    </w:tbl>
-    <w:p/>
+    <w:p>
+      <w:pPr>
+        <w:spacing w:after="160" w:line="264" w:lineRule="auto"/>
+      </w:pPr>
+      <w:r>
+        <w:rPr>
+          <w:rFonts w:ascii="Calibri" w:hAnsi="Calibri"/>
+          <w:b/>
+          <w:color w:val="0F172A"/>
+          <w:sz w:val="22"/>
+        </w:rPr>
+        <w:t xml:space="preserve">Ponto de atencao. </w:t>
+      </w:r>
+      <w:r>
+        <w:rPr>
+          <w:rFonts w:ascii="Calibri" w:hAnsi="Calibri"/>
+          <w:color w:val="0F172A"/>
+          <w:sz w:val="22"/>
+        </w:rPr>
+        <w:t>A segurança depende de JWT_SECRET forte, MASTER_PASSWORD seguro, uso de HTTPS em produção e controle adequado das variáveis .env.</w:t>
+      </w:r>
+    </w:p>
     <w:p>
       <w:pPr>
         <w:pStyle w:val="Heading1"/>
@@ -3934,10 +4349,1271 @@
         <w:rPr>
           <w:rFonts w:ascii="Calibri" w:hAnsi="Calibri"/>
           <w:b/>
-          <w:color w:val="2E74B5"/>
+          <w:color w:val="0F172A"/>
           <w:sz w:val="32"/>
         </w:rPr>
-        <w:t>10. Testes e validacao</w:t>
+        <w:t>10. Requisitos e regras de negócio</w:t>
+      </w:r>
+    </w:p>
+    <w:p>
+      <w:pPr>
+        <w:pStyle w:val="Heading2"/>
+        <w:spacing w:before="240" w:after="120"/>
+      </w:pPr>
+      <w:r>
+        <w:rPr>
+          <w:rFonts w:ascii="Calibri" w:hAnsi="Calibri"/>
+          <w:b/>
+          <w:color w:val="0F172A"/>
+          <w:sz w:val="26"/>
+        </w:rPr>
+        <w:t>10.1 Requisitos funcionais</w:t>
+      </w:r>
+    </w:p>
+    <w:tbl>
+      <w:tblPr>
+        <w:tblW w:type="dxa" w:w="9360"/>
+        <w:jc w:val="center"/>
+        <w:tblLook w:firstColumn="1" w:firstRow="1" w:lastColumn="0" w:lastRow="0" w:noHBand="0" w:noVBand="1" w:val="04A0"/>
+        <w:tblBorders>
+          <w:top w:val="single" w:sz="6" w:space="0" w:color="D7DBE2"/>
+          <w:left w:val="single" w:sz="6" w:space="0" w:color="D7DBE2"/>
+          <w:bottom w:val="single" w:sz="6" w:space="0" w:color="D7DBE2"/>
+          <w:right w:val="single" w:sz="6" w:space="0" w:color="D7DBE2"/>
+          <w:insideH w:val="single" w:sz="6" w:space="0" w:color="D7DBE2"/>
+          <w:insideV w:val="single" w:sz="6" w:space="0" w:color="D7DBE2"/>
+        </w:tblBorders>
+      </w:tblPr>
+      <w:tblGrid>
+        <w:gridCol w:w="900"/>
+        <w:gridCol w:w="3600"/>
+        <w:gridCol w:w="4860"/>
+      </w:tblGrid>
+      <w:tr>
+        <w:tc>
+          <w:tcPr>
+            <w:tcW w:type="dxa" w:w="900"/>
+            <w:tcMar>
+              <w:top w:w="80" w:type="dxa"/>
+              <w:start w:w="120" w:type="dxa"/>
+              <w:bottom w:w="80" w:type="dxa"/>
+              <w:end w:w="120" w:type="dxa"/>
+            </w:tcMar>
+            <w:vAlign w:val="center"/>
+            <w:shd w:fill="1F2937"/>
+          </w:tcPr>
+          <w:p>
+            <w:pPr>
+              <w:spacing w:after="0"/>
+            </w:pPr>
+            <w:r/>
+            <w:r>
+              <w:rPr>
+                <w:rFonts w:ascii="Calibri" w:hAnsi="Calibri"/>
+                <w:b/>
+                <w:color w:val="FFFFFF"/>
+                <w:sz w:val="20"/>
+              </w:rPr>
+              <w:t>ID</w:t>
+            </w:r>
+          </w:p>
+        </w:tc>
+        <w:tc>
+          <w:tcPr>
+            <w:tcW w:type="dxa" w:w="3600"/>
+            <w:tcMar>
+              <w:top w:w="80" w:type="dxa"/>
+              <w:start w:w="120" w:type="dxa"/>
+              <w:bottom w:w="80" w:type="dxa"/>
+              <w:end w:w="120" w:type="dxa"/>
+            </w:tcMar>
+            <w:vAlign w:val="center"/>
+            <w:shd w:fill="1F2937"/>
+          </w:tcPr>
+          <w:p>
+            <w:pPr>
+              <w:spacing w:after="0"/>
+            </w:pPr>
+            <w:r/>
+            <w:r>
+              <w:rPr>
+                <w:rFonts w:ascii="Calibri" w:hAnsi="Calibri"/>
+                <w:b/>
+                <w:color w:val="FFFFFF"/>
+                <w:sz w:val="20"/>
+              </w:rPr>
+              <w:t>Requisito</w:t>
+            </w:r>
+          </w:p>
+        </w:tc>
+        <w:tc>
+          <w:tcPr>
+            <w:tcW w:type="dxa" w:w="4860"/>
+            <w:tcMar>
+              <w:top w:w="80" w:type="dxa"/>
+              <w:start w:w="120" w:type="dxa"/>
+              <w:bottom w:w="80" w:type="dxa"/>
+              <w:end w:w="120" w:type="dxa"/>
+            </w:tcMar>
+            <w:vAlign w:val="center"/>
+            <w:shd w:fill="1F2937"/>
+          </w:tcPr>
+          <w:p>
+            <w:pPr>
+              <w:spacing w:after="0"/>
+            </w:pPr>
+            <w:r/>
+            <w:r>
+              <w:rPr>
+                <w:rFonts w:ascii="Calibri" w:hAnsi="Calibri"/>
+                <w:b/>
+                <w:color w:val="FFFFFF"/>
+                <w:sz w:val="20"/>
+              </w:rPr>
+              <w:t>Critério de aceite</w:t>
+            </w:r>
+          </w:p>
+        </w:tc>
+      </w:tr>
+      <w:tr>
+        <w:tc>
+          <w:tcPr>
+            <w:tcW w:type="dxa" w:w="900"/>
+            <w:tcMar>
+              <w:top w:w="80" w:type="dxa"/>
+              <w:start w:w="120" w:type="dxa"/>
+              <w:bottom w:w="80" w:type="dxa"/>
+              <w:end w:w="120" w:type="dxa"/>
+            </w:tcMar>
+            <w:vAlign w:val="center"/>
+          </w:tcPr>
+          <w:p>
+            <w:pPr>
+              <w:spacing w:after="0"/>
+            </w:pPr>
+            <w:r/>
+            <w:r>
+              <w:rPr>
+                <w:rFonts w:ascii="Calibri" w:hAnsi="Calibri"/>
+                <w:b w:val="0"/>
+                <w:color w:val="0F172A"/>
+                <w:sz w:val="19"/>
+              </w:rPr>
+              <w:t>RF01</w:t>
+            </w:r>
+          </w:p>
+        </w:tc>
+        <w:tc>
+          <w:tcPr>
+            <w:tcW w:type="dxa" w:w="3600"/>
+            <w:tcMar>
+              <w:top w:w="80" w:type="dxa"/>
+              <w:start w:w="120" w:type="dxa"/>
+              <w:bottom w:w="80" w:type="dxa"/>
+              <w:end w:w="120" w:type="dxa"/>
+            </w:tcMar>
+            <w:vAlign w:val="center"/>
+          </w:tcPr>
+          <w:p>
+            <w:pPr>
+              <w:spacing w:after="0"/>
+            </w:pPr>
+            <w:r/>
+            <w:r>
+              <w:rPr>
+                <w:rFonts w:ascii="Calibri" w:hAnsi="Calibri"/>
+                <w:b w:val="0"/>
+                <w:color w:val="0F172A"/>
+                <w:sz w:val="19"/>
+              </w:rPr>
+              <w:t>Cadastrar e autenticar usuários</w:t>
+            </w:r>
+          </w:p>
+        </w:tc>
+        <w:tc>
+          <w:tcPr>
+            <w:tcW w:type="dxa" w:w="4860"/>
+            <w:tcMar>
+              <w:top w:w="80" w:type="dxa"/>
+              <w:start w:w="120" w:type="dxa"/>
+              <w:bottom w:w="80" w:type="dxa"/>
+              <w:end w:w="120" w:type="dxa"/>
+            </w:tcMar>
+            <w:vAlign w:val="center"/>
+          </w:tcPr>
+          <w:p>
+            <w:pPr>
+              <w:spacing w:after="0"/>
+            </w:pPr>
+            <w:r/>
+            <w:r>
+              <w:rPr>
+                <w:rFonts w:ascii="Calibri" w:hAnsi="Calibri"/>
+                <w:b w:val="0"/>
+                <w:color w:val="0F172A"/>
+                <w:sz w:val="19"/>
+              </w:rPr>
+              <w:t>Conta é criada, verificada e recebe sessão válida.</w:t>
+            </w:r>
+          </w:p>
+        </w:tc>
+      </w:tr>
+      <w:tr>
+        <w:tc>
+          <w:tcPr>
+            <w:tcW w:type="dxa" w:w="900"/>
+            <w:tcMar>
+              <w:top w:w="80" w:type="dxa"/>
+              <w:start w:w="120" w:type="dxa"/>
+              <w:bottom w:w="80" w:type="dxa"/>
+              <w:end w:w="120" w:type="dxa"/>
+            </w:tcMar>
+            <w:vAlign w:val="center"/>
+            <w:shd w:fill="F3F4F6"/>
+          </w:tcPr>
+          <w:p>
+            <w:pPr>
+              <w:spacing w:after="0"/>
+            </w:pPr>
+            <w:r/>
+            <w:r>
+              <w:rPr>
+                <w:rFonts w:ascii="Calibri" w:hAnsi="Calibri"/>
+                <w:b w:val="0"/>
+                <w:color w:val="0F172A"/>
+                <w:sz w:val="19"/>
+              </w:rPr>
+              <w:t>RF02</w:t>
+            </w:r>
+          </w:p>
+        </w:tc>
+        <w:tc>
+          <w:tcPr>
+            <w:tcW w:type="dxa" w:w="3600"/>
+            <w:tcMar>
+              <w:top w:w="80" w:type="dxa"/>
+              <w:start w:w="120" w:type="dxa"/>
+              <w:bottom w:w="80" w:type="dxa"/>
+              <w:end w:w="120" w:type="dxa"/>
+            </w:tcMar>
+            <w:vAlign w:val="center"/>
+            <w:shd w:fill="F3F4F6"/>
+          </w:tcPr>
+          <w:p>
+            <w:pPr>
+              <w:spacing w:after="0"/>
+            </w:pPr>
+            <w:r/>
+            <w:r>
+              <w:rPr>
+                <w:rFonts w:ascii="Calibri" w:hAnsi="Calibri"/>
+                <w:b w:val="0"/>
+                <w:color w:val="0F172A"/>
+                <w:sz w:val="19"/>
+              </w:rPr>
+              <w:t>Gerar simulados</w:t>
+            </w:r>
+          </w:p>
+        </w:tc>
+        <w:tc>
+          <w:tcPr>
+            <w:tcW w:type="dxa" w:w="4860"/>
+            <w:tcMar>
+              <w:top w:w="80" w:type="dxa"/>
+              <w:start w:w="120" w:type="dxa"/>
+              <w:bottom w:w="80" w:type="dxa"/>
+              <w:end w:w="120" w:type="dxa"/>
+            </w:tcMar>
+            <w:vAlign w:val="center"/>
+            <w:shd w:fill="F3F4F6"/>
+          </w:tcPr>
+          <w:p>
+            <w:pPr>
+              <w:spacing w:after="0"/>
+            </w:pPr>
+            <w:r/>
+            <w:r>
+              <w:rPr>
+                <w:rFonts w:ascii="Calibri" w:hAnsi="Calibri"/>
+                <w:b w:val="0"/>
+                <w:color w:val="0F172A"/>
+                <w:sz w:val="19"/>
+              </w:rPr>
+              <w:t>Questões são apresentadas e a tentativa fica associada ao aluno.</w:t>
+            </w:r>
+          </w:p>
+        </w:tc>
+      </w:tr>
+      <w:tr>
+        <w:tc>
+          <w:tcPr>
+            <w:tcW w:type="dxa" w:w="900"/>
+            <w:tcMar>
+              <w:top w:w="80" w:type="dxa"/>
+              <w:start w:w="120" w:type="dxa"/>
+              <w:bottom w:w="80" w:type="dxa"/>
+              <w:end w:w="120" w:type="dxa"/>
+            </w:tcMar>
+            <w:vAlign w:val="center"/>
+          </w:tcPr>
+          <w:p>
+            <w:pPr>
+              <w:spacing w:after="0"/>
+            </w:pPr>
+            <w:r/>
+            <w:r>
+              <w:rPr>
+                <w:rFonts w:ascii="Calibri" w:hAnsi="Calibri"/>
+                <w:b w:val="0"/>
+                <w:color w:val="0F172A"/>
+                <w:sz w:val="19"/>
+              </w:rPr>
+              <w:t>RF03</w:t>
+            </w:r>
+          </w:p>
+        </w:tc>
+        <w:tc>
+          <w:tcPr>
+            <w:tcW w:type="dxa" w:w="3600"/>
+            <w:tcMar>
+              <w:top w:w="80" w:type="dxa"/>
+              <w:start w:w="120" w:type="dxa"/>
+              <w:bottom w:w="80" w:type="dxa"/>
+              <w:end w:w="120" w:type="dxa"/>
+            </w:tcMar>
+            <w:vAlign w:val="center"/>
+          </w:tcPr>
+          <w:p>
+            <w:pPr>
+              <w:spacing w:after="0"/>
+            </w:pPr>
+            <w:r/>
+            <w:r>
+              <w:rPr>
+                <w:rFonts w:ascii="Calibri" w:hAnsi="Calibri"/>
+                <w:b w:val="0"/>
+                <w:color w:val="0F172A"/>
+                <w:sz w:val="19"/>
+              </w:rPr>
+              <w:t>Finalizar e corrigir prova</w:t>
+            </w:r>
+          </w:p>
+        </w:tc>
+        <w:tc>
+          <w:tcPr>
+            <w:tcW w:type="dxa" w:w="4860"/>
+            <w:tcMar>
+              <w:top w:w="80" w:type="dxa"/>
+              <w:start w:w="120" w:type="dxa"/>
+              <w:bottom w:w="80" w:type="dxa"/>
+              <w:end w:w="120" w:type="dxa"/>
+            </w:tcMar>
+            <w:vAlign w:val="center"/>
+          </w:tcPr>
+          <w:p>
+            <w:pPr>
+              <w:spacing w:after="0"/>
+            </w:pPr>
+            <w:r/>
+            <w:r>
+              <w:rPr>
+                <w:rFonts w:ascii="Calibri" w:hAnsi="Calibri"/>
+                <w:b w:val="0"/>
+                <w:color w:val="0F172A"/>
+                <w:sz w:val="19"/>
+              </w:rPr>
+              <w:t>Resultado, acertos, XP, nível e histórico são persistidos.</w:t>
+            </w:r>
+          </w:p>
+        </w:tc>
+      </w:tr>
+      <w:tr>
+        <w:tc>
+          <w:tcPr>
+            <w:tcW w:type="dxa" w:w="900"/>
+            <w:tcMar>
+              <w:top w:w="80" w:type="dxa"/>
+              <w:start w:w="120" w:type="dxa"/>
+              <w:bottom w:w="80" w:type="dxa"/>
+              <w:end w:w="120" w:type="dxa"/>
+            </w:tcMar>
+            <w:vAlign w:val="center"/>
+            <w:shd w:fill="F3F4F6"/>
+          </w:tcPr>
+          <w:p>
+            <w:pPr>
+              <w:spacing w:after="0"/>
+            </w:pPr>
+            <w:r/>
+            <w:r>
+              <w:rPr>
+                <w:rFonts w:ascii="Calibri" w:hAnsi="Calibri"/>
+                <w:b w:val="0"/>
+                <w:color w:val="0F172A"/>
+                <w:sz w:val="19"/>
+              </w:rPr>
+              <w:t>RF04</w:t>
+            </w:r>
+          </w:p>
+        </w:tc>
+        <w:tc>
+          <w:tcPr>
+            <w:tcW w:type="dxa" w:w="3600"/>
+            <w:tcMar>
+              <w:top w:w="80" w:type="dxa"/>
+              <w:start w:w="120" w:type="dxa"/>
+              <w:bottom w:w="80" w:type="dxa"/>
+              <w:end w:w="120" w:type="dxa"/>
+            </w:tcMar>
+            <w:vAlign w:val="center"/>
+            <w:shd w:fill="F3F4F6"/>
+          </w:tcPr>
+          <w:p>
+            <w:pPr>
+              <w:spacing w:after="0"/>
+            </w:pPr>
+            <w:r/>
+            <w:r>
+              <w:rPr>
+                <w:rFonts w:ascii="Calibri" w:hAnsi="Calibri"/>
+                <w:b w:val="0"/>
+                <w:color w:val="0F172A"/>
+                <w:sz w:val="19"/>
+              </w:rPr>
+              <w:t>Aplicar prova ao vivo</w:t>
+            </w:r>
+          </w:p>
+        </w:tc>
+        <w:tc>
+          <w:tcPr>
+            <w:tcW w:type="dxa" w:w="4860"/>
+            <w:tcMar>
+              <w:top w:w="80" w:type="dxa"/>
+              <w:start w:w="120" w:type="dxa"/>
+              <w:bottom w:w="80" w:type="dxa"/>
+              <w:end w:w="120" w:type="dxa"/>
+            </w:tcMar>
+            <w:vAlign w:val="center"/>
+            <w:shd w:fill="F3F4F6"/>
+          </w:tcPr>
+          <w:p>
+            <w:pPr>
+              <w:spacing w:after="0"/>
+            </w:pPr>
+            <w:r/>
+            <w:r>
+              <w:rPr>
+                <w:rFonts w:ascii="Calibri" w:hAnsi="Calibri"/>
+                <w:b w:val="0"/>
+                <w:color w:val="0F172A"/>
+                <w:sz w:val="19"/>
+              </w:rPr>
+              <w:t>Código, horário, sala e limite de participantes são validados.</w:t>
+            </w:r>
+          </w:p>
+        </w:tc>
+      </w:tr>
+      <w:tr>
+        <w:tc>
+          <w:tcPr>
+            <w:tcW w:type="dxa" w:w="900"/>
+            <w:tcMar>
+              <w:top w:w="80" w:type="dxa"/>
+              <w:start w:w="120" w:type="dxa"/>
+              <w:bottom w:w="80" w:type="dxa"/>
+              <w:end w:w="120" w:type="dxa"/>
+            </w:tcMar>
+            <w:vAlign w:val="center"/>
+          </w:tcPr>
+          <w:p>
+            <w:pPr>
+              <w:spacing w:after="0"/>
+            </w:pPr>
+            <w:r/>
+            <w:r>
+              <w:rPr>
+                <w:rFonts w:ascii="Calibri" w:hAnsi="Calibri"/>
+                <w:b w:val="0"/>
+                <w:color w:val="0F172A"/>
+                <w:sz w:val="19"/>
+              </w:rPr>
+              <w:t>RF05</w:t>
+            </w:r>
+          </w:p>
+        </w:tc>
+        <w:tc>
+          <w:tcPr>
+            <w:tcW w:type="dxa" w:w="3600"/>
+            <w:tcMar>
+              <w:top w:w="80" w:type="dxa"/>
+              <w:start w:w="120" w:type="dxa"/>
+              <w:bottom w:w="80" w:type="dxa"/>
+              <w:end w:w="120" w:type="dxa"/>
+            </w:tcMar>
+            <w:vAlign w:val="center"/>
+          </w:tcPr>
+          <w:p>
+            <w:pPr>
+              <w:spacing w:after="0"/>
+            </w:pPr>
+            <w:r/>
+            <w:r>
+              <w:rPr>
+                <w:rFonts w:ascii="Calibri" w:hAnsi="Calibri"/>
+                <w:b w:val="0"/>
+                <w:color w:val="0F172A"/>
+                <w:sz w:val="19"/>
+              </w:rPr>
+              <w:t>Administrar estrutura</w:t>
+            </w:r>
+          </w:p>
+        </w:tc>
+        <w:tc>
+          <w:tcPr>
+            <w:tcW w:type="dxa" w:w="4860"/>
+            <w:tcMar>
+              <w:top w:w="80" w:type="dxa"/>
+              <w:start w:w="120" w:type="dxa"/>
+              <w:bottom w:w="80" w:type="dxa"/>
+              <w:end w:w="120" w:type="dxa"/>
+            </w:tcMar>
+            <w:vAlign w:val="center"/>
+          </w:tcPr>
+          <w:p>
+            <w:pPr>
+              <w:spacing w:after="0"/>
+            </w:pPr>
+            <w:r/>
+            <w:r>
+              <w:rPr>
+                <w:rFonts w:ascii="Calibri" w:hAnsi="Calibri"/>
+                <w:b w:val="0"/>
+                <w:color w:val="0F172A"/>
+                <w:sz w:val="19"/>
+              </w:rPr>
+              <w:t>Perfis autorizados gerenciam empresa, escola, período e sala.</w:t>
+            </w:r>
+          </w:p>
+        </w:tc>
+      </w:tr>
+      <w:tr>
+        <w:tc>
+          <w:tcPr>
+            <w:tcW w:type="dxa" w:w="900"/>
+            <w:tcMar>
+              <w:top w:w="80" w:type="dxa"/>
+              <w:start w:w="120" w:type="dxa"/>
+              <w:bottom w:w="80" w:type="dxa"/>
+              <w:end w:w="120" w:type="dxa"/>
+            </w:tcMar>
+            <w:vAlign w:val="center"/>
+            <w:shd w:fill="F3F4F6"/>
+          </w:tcPr>
+          <w:p>
+            <w:pPr>
+              <w:spacing w:after="0"/>
+            </w:pPr>
+            <w:r/>
+            <w:r>
+              <w:rPr>
+                <w:rFonts w:ascii="Calibri" w:hAnsi="Calibri"/>
+                <w:b w:val="0"/>
+                <w:color w:val="0F172A"/>
+                <w:sz w:val="19"/>
+              </w:rPr>
+              <w:t>RF06</w:t>
+            </w:r>
+          </w:p>
+        </w:tc>
+        <w:tc>
+          <w:tcPr>
+            <w:tcW w:type="dxa" w:w="3600"/>
+            <w:tcMar>
+              <w:top w:w="80" w:type="dxa"/>
+              <w:start w:w="120" w:type="dxa"/>
+              <w:bottom w:w="80" w:type="dxa"/>
+              <w:end w:w="120" w:type="dxa"/>
+            </w:tcMar>
+            <w:vAlign w:val="center"/>
+            <w:shd w:fill="F3F4F6"/>
+          </w:tcPr>
+          <w:p>
+            <w:pPr>
+              <w:spacing w:after="0"/>
+            </w:pPr>
+            <w:r/>
+            <w:r>
+              <w:rPr>
+                <w:rFonts w:ascii="Calibri" w:hAnsi="Calibri"/>
+                <w:b w:val="0"/>
+                <w:color w:val="0F172A"/>
+                <w:sz w:val="19"/>
+              </w:rPr>
+              <w:t>Produzir relatórios</w:t>
+            </w:r>
+          </w:p>
+        </w:tc>
+        <w:tc>
+          <w:tcPr>
+            <w:tcW w:type="dxa" w:w="4860"/>
+            <w:tcMar>
+              <w:top w:w="80" w:type="dxa"/>
+              <w:start w:w="120" w:type="dxa"/>
+              <w:bottom w:w="80" w:type="dxa"/>
+              <w:end w:w="120" w:type="dxa"/>
+            </w:tcMar>
+            <w:vAlign w:val="center"/>
+            <w:shd w:fill="F3F4F6"/>
+          </w:tcPr>
+          <w:p>
+            <w:pPr>
+              <w:spacing w:after="0"/>
+            </w:pPr>
+            <w:r/>
+            <w:r>
+              <w:rPr>
+                <w:rFonts w:ascii="Calibri" w:hAnsi="Calibri"/>
+                <w:b w:val="0"/>
+                <w:color w:val="0F172A"/>
+                <w:sz w:val="19"/>
+              </w:rPr>
+              <w:t>Professor exporta dados de suas provas e turmas em PDF ou XLSX.</w:t>
+            </w:r>
+          </w:p>
+        </w:tc>
+      </w:tr>
+      <w:tr>
+        <w:tc>
+          <w:tcPr>
+            <w:tcW w:type="dxa" w:w="900"/>
+            <w:tcMar>
+              <w:top w:w="80" w:type="dxa"/>
+              <w:start w:w="120" w:type="dxa"/>
+              <w:bottom w:w="80" w:type="dxa"/>
+              <w:end w:w="120" w:type="dxa"/>
+            </w:tcMar>
+            <w:vAlign w:val="center"/>
+          </w:tcPr>
+          <w:p>
+            <w:pPr>
+              <w:spacing w:after="0"/>
+            </w:pPr>
+            <w:r/>
+            <w:r>
+              <w:rPr>
+                <w:rFonts w:ascii="Calibri" w:hAnsi="Calibri"/>
+                <w:b w:val="0"/>
+                <w:color w:val="0F172A"/>
+                <w:sz w:val="19"/>
+              </w:rPr>
+              <w:t>RF07</w:t>
+            </w:r>
+          </w:p>
+        </w:tc>
+        <w:tc>
+          <w:tcPr>
+            <w:tcW w:type="dxa" w:w="3600"/>
+            <w:tcMar>
+              <w:top w:w="80" w:type="dxa"/>
+              <w:start w:w="120" w:type="dxa"/>
+              <w:bottom w:w="80" w:type="dxa"/>
+              <w:end w:w="120" w:type="dxa"/>
+            </w:tcMar>
+            <w:vAlign w:val="center"/>
+          </w:tcPr>
+          <w:p>
+            <w:pPr>
+              <w:spacing w:after="0"/>
+            </w:pPr>
+            <w:r/>
+            <w:r>
+              <w:rPr>
+                <w:rFonts w:ascii="Calibri" w:hAnsi="Calibri"/>
+                <w:b w:val="0"/>
+                <w:color w:val="0F172A"/>
+                <w:sz w:val="19"/>
+              </w:rPr>
+              <w:t>Gamificar progresso</w:t>
+            </w:r>
+          </w:p>
+        </w:tc>
+        <w:tc>
+          <w:tcPr>
+            <w:tcW w:type="dxa" w:w="4860"/>
+            <w:tcMar>
+              <w:top w:w="80" w:type="dxa"/>
+              <w:start w:w="120" w:type="dxa"/>
+              <w:bottom w:w="80" w:type="dxa"/>
+              <w:end w:w="120" w:type="dxa"/>
+            </w:tcMar>
+            <w:vAlign w:val="center"/>
+          </w:tcPr>
+          <w:p>
+            <w:pPr>
+              <w:spacing w:after="0"/>
+            </w:pPr>
+            <w:r/>
+            <w:r>
+              <w:rPr>
+                <w:rFonts w:ascii="Calibri" w:hAnsi="Calibri"/>
+                <w:b w:val="0"/>
+                <w:color w:val="0F172A"/>
+                <w:sz w:val="19"/>
+              </w:rPr>
+              <w:t>Conquistas únicas são registradas e notificadas no cliente.</w:t>
+            </w:r>
+          </w:p>
+        </w:tc>
+      </w:tr>
+    </w:tbl>
+    <w:p/>
+    <w:p>
+      <w:pPr>
+        <w:pStyle w:val="Heading2"/>
+        <w:spacing w:before="240" w:after="120"/>
+      </w:pPr>
+      <w:r>
+        <w:rPr>
+          <w:rFonts w:ascii="Calibri" w:hAnsi="Calibri"/>
+          <w:b/>
+          <w:color w:val="0F172A"/>
+          <w:sz w:val="26"/>
+        </w:rPr>
+        <w:t>10.2 Requisitos não funcionais</w:t>
+      </w:r>
+    </w:p>
+    <w:tbl>
+      <w:tblPr>
+        <w:tblW w:type="dxa" w:w="9360"/>
+        <w:jc w:val="center"/>
+        <w:tblLook w:firstColumn="1" w:firstRow="1" w:lastColumn="0" w:lastRow="0" w:noHBand="0" w:noVBand="1" w:val="04A0"/>
+        <w:tblBorders>
+          <w:top w:val="single" w:sz="6" w:space="0" w:color="D7DBE2"/>
+          <w:left w:val="single" w:sz="6" w:space="0" w:color="D7DBE2"/>
+          <w:bottom w:val="single" w:sz="6" w:space="0" w:color="D7DBE2"/>
+          <w:right w:val="single" w:sz="6" w:space="0" w:color="D7DBE2"/>
+          <w:insideH w:val="single" w:sz="6" w:space="0" w:color="D7DBE2"/>
+          <w:insideV w:val="single" w:sz="6" w:space="0" w:color="D7DBE2"/>
+        </w:tblBorders>
+      </w:tblPr>
+      <w:tblGrid>
+        <w:gridCol w:w="2500"/>
+        <w:gridCol w:w="6860"/>
+      </w:tblGrid>
+      <w:tr>
+        <w:tc>
+          <w:tcPr>
+            <w:tcW w:type="dxa" w:w="2500"/>
+            <w:tcMar>
+              <w:top w:w="80" w:type="dxa"/>
+              <w:start w:w="120" w:type="dxa"/>
+              <w:bottom w:w="80" w:type="dxa"/>
+              <w:end w:w="120" w:type="dxa"/>
+            </w:tcMar>
+            <w:vAlign w:val="center"/>
+            <w:shd w:fill="1F2937"/>
+          </w:tcPr>
+          <w:p>
+            <w:pPr>
+              <w:spacing w:after="0"/>
+            </w:pPr>
+            <w:r/>
+            <w:r>
+              <w:rPr>
+                <w:rFonts w:ascii="Calibri" w:hAnsi="Calibri"/>
+                <w:b/>
+                <w:color w:val="FFFFFF"/>
+                <w:sz w:val="20"/>
+              </w:rPr>
+              <w:t>Categoria</w:t>
+            </w:r>
+          </w:p>
+        </w:tc>
+        <w:tc>
+          <w:tcPr>
+            <w:tcW w:type="dxa" w:w="6860"/>
+            <w:tcMar>
+              <w:top w:w="80" w:type="dxa"/>
+              <w:start w:w="120" w:type="dxa"/>
+              <w:bottom w:w="80" w:type="dxa"/>
+              <w:end w:w="120" w:type="dxa"/>
+            </w:tcMar>
+            <w:vAlign w:val="center"/>
+            <w:shd w:fill="1F2937"/>
+          </w:tcPr>
+          <w:p>
+            <w:pPr>
+              <w:spacing w:after="0"/>
+            </w:pPr>
+            <w:r/>
+            <w:r>
+              <w:rPr>
+                <w:rFonts w:ascii="Calibri" w:hAnsi="Calibri"/>
+                <w:b/>
+                <w:color w:val="FFFFFF"/>
+                <w:sz w:val="20"/>
+              </w:rPr>
+              <w:t>Diretriz adotada</w:t>
+            </w:r>
+          </w:p>
+        </w:tc>
+      </w:tr>
+      <w:tr>
+        <w:tc>
+          <w:tcPr>
+            <w:tcW w:type="dxa" w:w="2500"/>
+            <w:tcMar>
+              <w:top w:w="80" w:type="dxa"/>
+              <w:start w:w="120" w:type="dxa"/>
+              <w:bottom w:w="80" w:type="dxa"/>
+              <w:end w:w="120" w:type="dxa"/>
+            </w:tcMar>
+            <w:vAlign w:val="center"/>
+          </w:tcPr>
+          <w:p>
+            <w:pPr>
+              <w:spacing w:after="0"/>
+            </w:pPr>
+            <w:r/>
+            <w:r>
+              <w:rPr>
+                <w:rFonts w:ascii="Calibri" w:hAnsi="Calibri"/>
+                <w:b w:val="0"/>
+                <w:color w:val="0F172A"/>
+                <w:sz w:val="19"/>
+              </w:rPr>
+              <w:t>Segurança</w:t>
+            </w:r>
+          </w:p>
+        </w:tc>
+        <w:tc>
+          <w:tcPr>
+            <w:tcW w:type="dxa" w:w="6860"/>
+            <w:tcMar>
+              <w:top w:w="80" w:type="dxa"/>
+              <w:start w:w="120" w:type="dxa"/>
+              <w:bottom w:w="80" w:type="dxa"/>
+              <w:end w:w="120" w:type="dxa"/>
+            </w:tcMar>
+            <w:vAlign w:val="center"/>
+          </w:tcPr>
+          <w:p>
+            <w:pPr>
+              <w:spacing w:after="0"/>
+            </w:pPr>
+            <w:r/>
+            <w:r>
+              <w:rPr>
+                <w:rFonts w:ascii="Calibri" w:hAnsi="Calibri"/>
+                <w:b w:val="0"/>
+                <w:color w:val="0F172A"/>
+                <w:sz w:val="19"/>
+              </w:rPr>
+              <w:t>Autorização por papel, JWT, bcrypt, rate limit, CORS e validação de entrada.</w:t>
+            </w:r>
+          </w:p>
+        </w:tc>
+      </w:tr>
+      <w:tr>
+        <w:tc>
+          <w:tcPr>
+            <w:tcW w:type="dxa" w:w="2500"/>
+            <w:tcMar>
+              <w:top w:w="80" w:type="dxa"/>
+              <w:start w:w="120" w:type="dxa"/>
+              <w:bottom w:w="80" w:type="dxa"/>
+              <w:end w:w="120" w:type="dxa"/>
+            </w:tcMar>
+            <w:vAlign w:val="center"/>
+            <w:shd w:fill="F3F4F6"/>
+          </w:tcPr>
+          <w:p>
+            <w:pPr>
+              <w:spacing w:after="0"/>
+            </w:pPr>
+            <w:r/>
+            <w:r>
+              <w:rPr>
+                <w:rFonts w:ascii="Calibri" w:hAnsi="Calibri"/>
+                <w:b w:val="0"/>
+                <w:color w:val="0F172A"/>
+                <w:sz w:val="19"/>
+              </w:rPr>
+              <w:t>Usabilidade</w:t>
+            </w:r>
+          </w:p>
+        </w:tc>
+        <w:tc>
+          <w:tcPr>
+            <w:tcW w:type="dxa" w:w="6860"/>
+            <w:tcMar>
+              <w:top w:w="80" w:type="dxa"/>
+              <w:start w:w="120" w:type="dxa"/>
+              <w:bottom w:w="80" w:type="dxa"/>
+              <w:end w:w="120" w:type="dxa"/>
+            </w:tcMar>
+            <w:vAlign w:val="center"/>
+            <w:shd w:fill="F3F4F6"/>
+          </w:tcPr>
+          <w:p>
+            <w:pPr>
+              <w:spacing w:after="0"/>
+            </w:pPr>
+            <w:r/>
+            <w:r>
+              <w:rPr>
+                <w:rFonts w:ascii="Calibri" w:hAnsi="Calibri"/>
+                <w:b w:val="0"/>
+                <w:color w:val="0F172A"/>
+                <w:sz w:val="19"/>
+              </w:rPr>
+              <w:t>Telas distintas por perfil, feedback de carregamento e estados de erro compreensíveis.</w:t>
+            </w:r>
+          </w:p>
+        </w:tc>
+      </w:tr>
+      <w:tr>
+        <w:tc>
+          <w:tcPr>
+            <w:tcW w:type="dxa" w:w="2500"/>
+            <w:tcMar>
+              <w:top w:w="80" w:type="dxa"/>
+              <w:start w:w="120" w:type="dxa"/>
+              <w:bottom w:w="80" w:type="dxa"/>
+              <w:end w:w="120" w:type="dxa"/>
+            </w:tcMar>
+            <w:vAlign w:val="center"/>
+          </w:tcPr>
+          <w:p>
+            <w:pPr>
+              <w:spacing w:after="0"/>
+            </w:pPr>
+            <w:r/>
+            <w:r>
+              <w:rPr>
+                <w:rFonts w:ascii="Calibri" w:hAnsi="Calibri"/>
+                <w:b w:val="0"/>
+                <w:color w:val="0F172A"/>
+                <w:sz w:val="19"/>
+              </w:rPr>
+              <w:t>Confiabilidade</w:t>
+            </w:r>
+          </w:p>
+        </w:tc>
+        <w:tc>
+          <w:tcPr>
+            <w:tcW w:type="dxa" w:w="6860"/>
+            <w:tcMar>
+              <w:top w:w="80" w:type="dxa"/>
+              <w:start w:w="120" w:type="dxa"/>
+              <w:bottom w:w="80" w:type="dxa"/>
+              <w:end w:w="120" w:type="dxa"/>
+            </w:tcMar>
+            <w:vAlign w:val="center"/>
+          </w:tcPr>
+          <w:p>
+            <w:pPr>
+              <w:spacing w:after="0"/>
+            </w:pPr>
+            <w:r/>
+            <w:r>
+              <w:rPr>
+                <w:rFonts w:ascii="Calibri" w:hAnsi="Calibri"/>
+                <w:b w:val="0"/>
+                <w:color w:val="0F172A"/>
+                <w:sz w:val="19"/>
+              </w:rPr>
+              <w:t>Registro transacional de resultados, validação de prova ativa e tratamento centralizado de erros.</w:t>
+            </w:r>
+          </w:p>
+        </w:tc>
+      </w:tr>
+      <w:tr>
+        <w:tc>
+          <w:tcPr>
+            <w:tcW w:type="dxa" w:w="2500"/>
+            <w:tcMar>
+              <w:top w:w="80" w:type="dxa"/>
+              <w:start w:w="120" w:type="dxa"/>
+              <w:bottom w:w="80" w:type="dxa"/>
+              <w:end w:w="120" w:type="dxa"/>
+            </w:tcMar>
+            <w:vAlign w:val="center"/>
+            <w:shd w:fill="F3F4F6"/>
+          </w:tcPr>
+          <w:p>
+            <w:pPr>
+              <w:spacing w:after="0"/>
+            </w:pPr>
+            <w:r/>
+            <w:r>
+              <w:rPr>
+                <w:rFonts w:ascii="Calibri" w:hAnsi="Calibri"/>
+                <w:b w:val="0"/>
+                <w:color w:val="0F172A"/>
+                <w:sz w:val="19"/>
+              </w:rPr>
+              <w:t>Desempenho</w:t>
+            </w:r>
+          </w:p>
+        </w:tc>
+        <w:tc>
+          <w:tcPr>
+            <w:tcW w:type="dxa" w:w="6860"/>
+            <w:tcMar>
+              <w:top w:w="80" w:type="dxa"/>
+              <w:start w:w="120" w:type="dxa"/>
+              <w:bottom w:w="80" w:type="dxa"/>
+              <w:end w:w="120" w:type="dxa"/>
+            </w:tcMar>
+            <w:vAlign w:val="center"/>
+            <w:shd w:fill="F3F4F6"/>
+          </w:tcPr>
+          <w:p>
+            <w:pPr>
+              <w:spacing w:after="0"/>
+            </w:pPr>
+            <w:r/>
+            <w:r>
+              <w:rPr>
+                <w:rFonts w:ascii="Calibri" w:hAnsi="Calibri"/>
+                <w:b w:val="0"/>
+                <w:color w:val="0F172A"/>
+                <w:sz w:val="19"/>
+              </w:rPr>
+              <w:t>Compressão HTTP, cache control para estáticos, cache de aplicação e consultas segmentadas.</w:t>
+            </w:r>
+          </w:p>
+        </w:tc>
+      </w:tr>
+      <w:tr>
+        <w:tc>
+          <w:tcPr>
+            <w:tcW w:type="dxa" w:w="2500"/>
+            <w:tcMar>
+              <w:top w:w="80" w:type="dxa"/>
+              <w:start w:w="120" w:type="dxa"/>
+              <w:bottom w:w="80" w:type="dxa"/>
+              <w:end w:w="120" w:type="dxa"/>
+            </w:tcMar>
+            <w:vAlign w:val="center"/>
+          </w:tcPr>
+          <w:p>
+            <w:pPr>
+              <w:spacing w:after="0"/>
+            </w:pPr>
+            <w:r/>
+            <w:r>
+              <w:rPr>
+                <w:rFonts w:ascii="Calibri" w:hAnsi="Calibri"/>
+                <w:b w:val="0"/>
+                <w:color w:val="0F172A"/>
+                <w:sz w:val="19"/>
+              </w:rPr>
+              <w:t>Compatibilidade</w:t>
+            </w:r>
+          </w:p>
+        </w:tc>
+        <w:tc>
+          <w:tcPr>
+            <w:tcW w:type="dxa" w:w="6860"/>
+            <w:tcMar>
+              <w:top w:w="80" w:type="dxa"/>
+              <w:start w:w="120" w:type="dxa"/>
+              <w:bottom w:w="80" w:type="dxa"/>
+              <w:end w:w="120" w:type="dxa"/>
+            </w:tcMar>
+            <w:vAlign w:val="center"/>
+          </w:tcPr>
+          <w:p>
+            <w:pPr>
+              <w:spacing w:after="0"/>
+            </w:pPr>
+            <w:r/>
+            <w:r>
+              <w:rPr>
+                <w:rFonts w:ascii="Calibri" w:hAnsi="Calibri"/>
+                <w:b w:val="0"/>
+                <w:color w:val="0F172A"/>
+                <w:sz w:val="19"/>
+              </w:rPr>
+              <w:t>Aplicação web responsiva e PWA com service worker para ativos seguros.</w:t>
+            </w:r>
+          </w:p>
+        </w:tc>
+      </w:tr>
+      <w:tr>
+        <w:tc>
+          <w:tcPr>
+            <w:tcW w:type="dxa" w:w="2500"/>
+            <w:tcMar>
+              <w:top w:w="80" w:type="dxa"/>
+              <w:start w:w="120" w:type="dxa"/>
+              <w:bottom w:w="80" w:type="dxa"/>
+              <w:end w:w="120" w:type="dxa"/>
+            </w:tcMar>
+            <w:vAlign w:val="center"/>
+            <w:shd w:fill="F3F4F6"/>
+          </w:tcPr>
+          <w:p>
+            <w:pPr>
+              <w:spacing w:after="0"/>
+            </w:pPr>
+            <w:r/>
+            <w:r>
+              <w:rPr>
+                <w:rFonts w:ascii="Calibri" w:hAnsi="Calibri"/>
+                <w:b w:val="0"/>
+                <w:color w:val="0F172A"/>
+                <w:sz w:val="19"/>
+              </w:rPr>
+              <w:t>Manutenibilidade</w:t>
+            </w:r>
+          </w:p>
+        </w:tc>
+        <w:tc>
+          <w:tcPr>
+            <w:tcW w:type="dxa" w:w="6860"/>
+            <w:tcMar>
+              <w:top w:w="80" w:type="dxa"/>
+              <w:start w:w="120" w:type="dxa"/>
+              <w:bottom w:w="80" w:type="dxa"/>
+              <w:end w:w="120" w:type="dxa"/>
+            </w:tcMar>
+            <w:vAlign w:val="center"/>
+            <w:shd w:fill="F3F4F6"/>
+          </w:tcPr>
+          <w:p>
+            <w:pPr>
+              <w:spacing w:after="0"/>
+            </w:pPr>
+            <w:r/>
+            <w:r>
+              <w:rPr>
+                <w:rFonts w:ascii="Calibri" w:hAnsi="Calibri"/>
+                <w:b w:val="0"/>
+                <w:color w:val="0F172A"/>
+                <w:sz w:val="19"/>
+              </w:rPr>
+              <w:t>Rotas organizadas por domínio, configuração por ambiente e scripts de banco versionáveis.</w:t>
+            </w:r>
+          </w:p>
+        </w:tc>
+      </w:tr>
+    </w:tbl>
+    <w:p/>
+    <w:p>
+      <w:pPr>
+        <w:pStyle w:val="Heading2"/>
+        <w:spacing w:before="240" w:after="120"/>
+      </w:pPr>
+      <w:r>
+        <w:rPr>
+          <w:rFonts w:ascii="Calibri" w:hAnsi="Calibri"/>
+          <w:b/>
+          <w:color w:val="0F172A"/>
+          <w:sz w:val="26"/>
+        </w:rPr>
+        <w:t>10.3 Regras de negócio críticas</w:t>
+      </w:r>
+    </w:p>
+    <w:p>
+      <w:pPr>
+        <w:pStyle w:val="ListBullet"/>
+        <w:spacing w:after="80" w:line="280" w:lineRule="auto"/>
+      </w:pPr>
+      <w:r>
+        <w:rPr>
+          <w:rFonts w:ascii="Calibri" w:hAnsi="Calibri"/>
+          <w:color w:val="0F172A"/>
+          <w:sz w:val="22"/>
+        </w:rPr>
+        <w:t>Uma prova de professor só pode receber respostas enquanto estiver ativa e dentro de sua janela de aplicação.</w:t>
+      </w:r>
+    </w:p>
+    <w:p>
+      <w:pPr>
+        <w:pStyle w:val="ListBullet"/>
+        <w:spacing w:after="80" w:line="280" w:lineRule="auto"/>
+      </w:pPr>
+      <w:r>
+        <w:rPr>
+          <w:rFonts w:ascii="Calibri" w:hAnsi="Calibri"/>
+          <w:color w:val="0F172A"/>
+          <w:sz w:val="22"/>
+        </w:rPr>
+        <w:t>O aluno só pode ingressar se pertencer à sala permitida e houver capacidade disponível.</w:t>
+      </w:r>
+    </w:p>
+    <w:p>
+      <w:pPr>
+        <w:pStyle w:val="ListBullet"/>
+        <w:spacing w:after="80" w:line="280" w:lineRule="auto"/>
+      </w:pPr>
+      <w:r>
+        <w:rPr>
+          <w:rFonts w:ascii="Calibri" w:hAnsi="Calibri"/>
+          <w:color w:val="0F172A"/>
+          <w:sz w:val="22"/>
+        </w:rPr>
+        <w:t>A pontuação de uma tentativa finalizada não deve ser recalculada a partir de respostas parciais.</w:t>
+      </w:r>
+    </w:p>
+    <w:p>
+      <w:pPr>
+        <w:pStyle w:val="ListBullet"/>
+        <w:spacing w:after="80" w:line="280" w:lineRule="auto"/>
+      </w:pPr>
+      <w:r>
+        <w:rPr>
+          <w:rFonts w:ascii="Calibri" w:hAnsi="Calibri"/>
+          <w:color w:val="0F172A"/>
+          <w:sz w:val="22"/>
+        </w:rPr>
+        <w:t>A conquista é identificada por chave e só pode ser concedida uma vez para cada usuário.</w:t>
+      </w:r>
+    </w:p>
+    <w:p>
+      <w:pPr>
+        <w:pStyle w:val="ListBullet"/>
+        <w:spacing w:after="80" w:line="280" w:lineRule="auto"/>
+      </w:pPr>
+      <w:r>
+        <w:rPr>
+          <w:rFonts w:ascii="Calibri" w:hAnsi="Calibri"/>
+          <w:color w:val="0F172A"/>
+          <w:sz w:val="22"/>
+        </w:rPr>
+        <w:t>Operações administrativas respeitam o escopo do papel e da organização vinculada ao usuário autenticado.</w:t>
+      </w:r>
+    </w:p>
+    <w:p>
+      <w:pPr>
+        <w:pStyle w:val="ListBullet"/>
+        <w:spacing w:after="80" w:line="280" w:lineRule="auto"/>
+      </w:pPr>
+      <w:r>
+        <w:rPr>
+          <w:rFonts w:ascii="Calibri" w:hAnsi="Calibri"/>
+          <w:color w:val="0F172A"/>
+          <w:sz w:val="22"/>
+        </w:rPr>
+        <w:t>Credenciais e tokens não são conteúdos de interface nem devem ser inseridos no repositório ou em documentos públicos.</w:t>
+      </w:r>
+    </w:p>
+    <w:p>
+      <w:pPr>
+        <w:pStyle w:val="Heading1"/>
+        <w:spacing w:before="320" w:after="160"/>
+      </w:pPr>
+      <w:r>
+        <w:rPr>
+          <w:rFonts w:ascii="Calibri" w:hAnsi="Calibri"/>
+          <w:b/>
+          <w:color w:val="0F172A"/>
+          <w:sz w:val="32"/>
+        </w:rPr>
+        <w:t>11. Testes e validação</w:t>
       </w:r>
     </w:p>
     <w:p>
@@ -3984,7 +5660,7 @@
               <w:end w:w="120" w:type="dxa"/>
             </w:tcMar>
             <w:vAlign w:val="center"/>
-            <w:shd w:fill="F2F4F7"/>
+            <w:shd w:fill="1F2937"/>
           </w:tcPr>
           <w:p>
             <w:pPr>
@@ -3995,7 +5671,7 @@
               <w:rPr>
                 <w:rFonts w:ascii="Calibri" w:hAnsi="Calibri"/>
                 <w:b/>
-                <w:color w:val="0F172A"/>
+                <w:color w:val="FFFFFF"/>
                 <w:sz w:val="20"/>
               </w:rPr>
               <w:t>Verificacao</w:t>
@@ -4012,7 +5688,7 @@
               <w:end w:w="120" w:type="dxa"/>
             </w:tcMar>
             <w:vAlign w:val="center"/>
-            <w:shd w:fill="F2F4F7"/>
+            <w:shd w:fill="1F2937"/>
           </w:tcPr>
           <w:p>
             <w:pPr>
@@ -4023,7 +5699,7 @@
               <w:rPr>
                 <w:rFonts w:ascii="Calibri" w:hAnsi="Calibri"/>
                 <w:b/>
-                <w:color w:val="0F172A"/>
+                <w:color w:val="FFFFFF"/>
                 <w:sz w:val="20"/>
               </w:rPr>
               <w:t>Resultado</w:t>
@@ -4098,6 +5774,7 @@
               <w:end w:w="120" w:type="dxa"/>
             </w:tcMar>
             <w:vAlign w:val="center"/>
+            <w:shd w:fill="F3F4F6"/>
           </w:tcPr>
           <w:p>
             <w:pPr>
@@ -4125,6 +5802,7 @@
               <w:end w:w="120" w:type="dxa"/>
             </w:tcMar>
             <w:vAlign w:val="center"/>
+            <w:shd w:fill="F3F4F6"/>
           </w:tcPr>
           <w:p>
             <w:pPr>
@@ -4210,6 +5888,7 @@
               <w:end w:w="120" w:type="dxa"/>
             </w:tcMar>
             <w:vAlign w:val="center"/>
+            <w:shd w:fill="F3F4F6"/>
           </w:tcPr>
           <w:p>
             <w:pPr>
@@ -4237,6 +5916,7 @@
               <w:end w:w="120" w:type="dxa"/>
             </w:tcMar>
             <w:vAlign w:val="center"/>
+            <w:shd w:fill="F3F4F6"/>
           </w:tcPr>
           <w:p>
             <w:pPr>
@@ -4322,6 +6002,7 @@
               <w:end w:w="120" w:type="dxa"/>
             </w:tcMar>
             <w:vAlign w:val="center"/>
+            <w:shd w:fill="F3F4F6"/>
           </w:tcPr>
           <w:p>
             <w:pPr>
@@ -4349,6 +6030,7 @@
               <w:end w:w="120" w:type="dxa"/>
             </w:tcMar>
             <w:vAlign w:val="center"/>
+            <w:shd w:fill="F3F4F6"/>
           </w:tcPr>
           <w:p>
             <w:pPr>
@@ -4434,10 +6116,10 @@
         <w:rPr>
           <w:rFonts w:ascii="Calibri" w:hAnsi="Calibri"/>
           <w:b/>
-          <w:color w:val="2E74B5"/>
+          <w:color w:val="0F172A"/>
           <w:sz w:val="26"/>
         </w:rPr>
-        <w:t>10.1 Correcoes realizadas nesta revisao</w:t>
+        <w:t>11.1 Correções e estabilizações relevantes</w:t>
       </w:r>
     </w:p>
     <w:p>
@@ -4451,7 +6133,7 @@
           <w:color w:val="0F172A"/>
           <w:sz w:val="22"/>
         </w:rPr>
-        <w:t>Geracao de ENEM e Provao recebeu estado de carregamento, tratamento de erro e validacao de questoes antes de renderizar.</w:t>
+        <w:t>A renderização das questões usa escape de HTML e validação antes da montagem das alternativas, evitando falhas de referência e conteúdo inseguro.</w:t>
       </w:r>
     </w:p>
     <w:p>
@@ -4465,7 +6147,7 @@
           <w:color w:val="0F172A"/>
           <w:sz w:val="22"/>
         </w:rPr>
-        <w:t>Renderizacao das alternativas passou a usar botoes com classe .alternativa, evitando comportamento visual inconsistente.</w:t>
+        <w:t>O fluxo de simulados persiste a prova ativa antes da exibição e apresenta uma tela de conclusão com desempenho da tentativa.</w:t>
       </w:r>
     </w:p>
     <w:p>
@@ -4479,7 +6161,7 @@
           <w:color w:val="0F172A"/>
           <w:sz w:val="22"/>
         </w:rPr>
-        <w:t>Fluxo de prova ao vivo foi corrigido para separar resposta parcial de resposta finalizada.</w:t>
+        <w:t>A prova ao vivo separa salvamento parcial de finalização definitiva, preservando placar e correção coerentes.</w:t>
       </w:r>
     </w:p>
     <w:p>
@@ -4493,7 +6175,7 @@
           <w:color w:val="0F172A"/>
           <w:sz w:val="22"/>
         </w:rPr>
-        <w:t>Tabela respostas_provas_professor recebeu coluna finalizada, tambem registrada em migration SQL.</w:t>
+        <w:t>A tabela respostas_provas_professor registra a coluna finalizada, e o schema cria participantes e limite de alunos para a prova ao vivo.</w:t>
       </w:r>
     </w:p>
     <w:p>
@@ -4507,7 +6189,7 @@
           <w:color w:val="0F172A"/>
           <w:sz w:val="22"/>
         </w:rPr>
-        <w:t>Schema inicial passou a criar max_alunos e provas_professor_participantes, estruturas usadas pelo fluxo ao vivo.</w:t>
+        <w:t>O service worker foi revisado para não interceptar áreas autenticadas e evitar cache indevido de respostas administrativas.</w:t>
       </w:r>
     </w:p>
     <w:p>
@@ -4521,7 +6203,7 @@
           <w:color w:val="0F172A"/>
           <w:sz w:val="22"/>
         </w:rPr>
-        <w:t>Service worker teve erro de sintaxe corrigido e cache atualizado para v2.</w:t>
+        <w:t>Conquistas possuem histórico único por usuário e notificação visual no canto superior direito após novos marcos.</w:t>
       </w:r>
     </w:p>
     <w:p>
@@ -4533,10 +6215,10 @@
         <w:rPr>
           <w:rFonts w:ascii="Calibri" w:hAnsi="Calibri"/>
           <w:b/>
-          <w:color w:val="2E74B5"/>
+          <w:color w:val="0F172A"/>
           <w:sz w:val="32"/>
         </w:rPr>
-        <w:t>11. Implantacao e operacao</w:t>
+        <w:t>12. Implantação e operação</w:t>
       </w:r>
     </w:p>
     <w:p>
@@ -4551,7 +6233,7 @@
           <w:color w:val="0F172A"/>
           <w:sz w:val="22"/>
         </w:rPr>
-        <w:t>O projeto pode ser executado localmente com PostgreSQL via Docker Compose ou implantado em ambiente Node.js 20 com PostgreSQL externo. O arquivo .env.example descreve variaveis essenciais como DATABASE_URL, JWT_SECRET, MASTER_PASSWORD, credenciais de email e OpenRouter.</w:t>
+        <w:t>O projeto pode ser executado localmente com PostgreSQL via Docker Compose ou implantado em ambiente Node.js 20 com PostgreSQL externo. A configuração é orientada por variáveis de ambiente; segredos não devem ser incluídos em arquivos rastreados, capturas de tela ou documentação compartilhada.</w:t>
       </w:r>
     </w:p>
     <w:p>
@@ -4565,7 +6247,7 @@
           <w:color w:val="0F172A"/>
           <w:sz w:val="22"/>
         </w:rPr>
-        <w:t>Copiar .env.example para .env.</w:t>
+        <w:t>Copiar .env.example para .env e preencher apenas no ambiente local ou no cofre de segredos do provedor.</w:t>
       </w:r>
     </w:p>
     <w:p>
@@ -4579,7 +6261,7 @@
           <w:color w:val="0F172A"/>
           <w:sz w:val="22"/>
         </w:rPr>
-        <w:t>Subir o PostgreSQL com docker compose up -d postgres.</w:t>
+        <w:t>Subir o PostgreSQL com docker compose up -d postgres ou configurar DATABASE_URL para a instância gerenciada.</w:t>
       </w:r>
     </w:p>
     <w:p>
@@ -4593,7 +6275,7 @@
           <w:color w:val="0F172A"/>
           <w:sz w:val="22"/>
         </w:rPr>
-        <w:t>Instalar dependencias com npm install ou npm ci.</w:t>
+        <w:t>Instalar dependências com npm ci em ambientes reproduzíveis ou npm install no desenvolvimento inicial.</w:t>
       </w:r>
     </w:p>
     <w:p>
@@ -4607,7 +6289,7 @@
           <w:color w:val="0F172A"/>
           <w:sz w:val="22"/>
         </w:rPr>
-        <w:t>Executar migrations com npm run db:migrate quando necessario.</w:t>
+        <w:t>Executar migrations com npm run db:migrate antes de liberar uma versão que altere o schema.</w:t>
       </w:r>
     </w:p>
     <w:p>
@@ -4621,7 +6303,7 @@
           <w:color w:val="0F172A"/>
           <w:sz w:val="22"/>
         </w:rPr>
-        <w:t>Iniciar em desenvolvimento com npm run dev ou em producao com npm start.</w:t>
+        <w:t>Executar npm test e a checagem de sintaxe antes do deploy; iniciar com npm start em produção.</w:t>
       </w:r>
     </w:p>
     <w:tbl>
@@ -4653,7 +6335,7 @@
               <w:end w:w="120" w:type="dxa"/>
             </w:tcMar>
             <w:vAlign w:val="center"/>
-            <w:shd w:fill="F2F4F7"/>
+            <w:shd w:fill="1F2937"/>
           </w:tcPr>
           <w:p>
             <w:pPr>
@@ -4664,7 +6346,7 @@
               <w:rPr>
                 <w:rFonts w:ascii="Calibri" w:hAnsi="Calibri"/>
                 <w:b/>
-                <w:color w:val="0F172A"/>
+                <w:color w:val="FFFFFF"/>
                 <w:sz w:val="20"/>
               </w:rPr>
               <w:t>Variavel</w:t>
@@ -4681,7 +6363,7 @@
               <w:end w:w="120" w:type="dxa"/>
             </w:tcMar>
             <w:vAlign w:val="center"/>
-            <w:shd w:fill="F2F4F7"/>
+            <w:shd w:fill="1F2937"/>
           </w:tcPr>
           <w:p>
             <w:pPr>
@@ -4692,7 +6374,7 @@
               <w:rPr>
                 <w:rFonts w:ascii="Calibri" w:hAnsi="Calibri"/>
                 <w:b/>
-                <w:color w:val="0F172A"/>
+                <w:color w:val="FFFFFF"/>
                 <w:sz w:val="20"/>
               </w:rPr>
               <w:t>Descricao</w:t>
@@ -4767,6 +6449,7 @@
               <w:end w:w="120" w:type="dxa"/>
             </w:tcMar>
             <w:vAlign w:val="center"/>
+            <w:shd w:fill="F3F4F6"/>
           </w:tcPr>
           <w:p>
             <w:pPr>
@@ -4794,6 +6477,7 @@
               <w:end w:w="120" w:type="dxa"/>
             </w:tcMar>
             <w:vAlign w:val="center"/>
+            <w:shd w:fill="F3F4F6"/>
           </w:tcPr>
           <w:p>
             <w:pPr>
@@ -4879,6 +6563,7 @@
               <w:end w:w="120" w:type="dxa"/>
             </w:tcMar>
             <w:vAlign w:val="center"/>
+            <w:shd w:fill="F3F4F6"/>
           </w:tcPr>
           <w:p>
             <w:pPr>
@@ -4906,6 +6591,7 @@
               <w:end w:w="120" w:type="dxa"/>
             </w:tcMar>
             <w:vAlign w:val="center"/>
+            <w:shd w:fill="F3F4F6"/>
           </w:tcPr>
           <w:p>
             <w:pPr>
@@ -4975,7 +6661,7 @@
                 <w:color w:val="0F172A"/>
                 <w:sz w:val="19"/>
               </w:rPr>
-              <w:t>Envio de emails transacionais.</w:t>
+              <w:t>Credenciais do provedor SMTP; usar apenas se SMTP AUTH estiver habilitado para a caixa.</w:t>
             </w:r>
           </w:p>
         </w:tc>
@@ -4991,6 +6677,7 @@
               <w:end w:w="120" w:type="dxa"/>
             </w:tcMar>
             <w:vAlign w:val="center"/>
+            <w:shd w:fill="F3F4F6"/>
           </w:tcPr>
           <w:p>
             <w:pPr>
@@ -5018,6 +6705,7 @@
               <w:end w:w="120" w:type="dxa"/>
             </w:tcMar>
             <w:vAlign w:val="center"/>
+            <w:shd w:fill="F3F4F6"/>
           </w:tcPr>
           <w:p>
             <w:pPr>
@@ -5040,6 +6728,91 @@
     <w:p/>
     <w:p>
       <w:pPr>
+        <w:pStyle w:val="Heading2"/>
+        <w:spacing w:before="240" w:after="120"/>
+      </w:pPr>
+      <w:r>
+        <w:rPr>
+          <w:rFonts w:ascii="Calibri" w:hAnsi="Calibri"/>
+          <w:b/>
+          <w:color w:val="0F172A"/>
+          <w:sz w:val="26"/>
+        </w:rPr>
+        <w:t>12.1 Checklist de liberação</w:t>
+      </w:r>
+    </w:p>
+    <w:p>
+      <w:pPr>
+        <w:pStyle w:val="ListBullet"/>
+        <w:spacing w:after="80" w:line="280" w:lineRule="auto"/>
+      </w:pPr>
+      <w:r>
+        <w:rPr>
+          <w:rFonts w:ascii="Calibri" w:hAnsi="Calibri"/>
+          <w:color w:val="0F172A"/>
+          <w:sz w:val="22"/>
+        </w:rPr>
+        <w:t>Confirmar que DATABASE_URL, JWT_SECRET, APP_URL e variáveis de IA/e-mail estão disponíveis no ambiente de destino.</w:t>
+      </w:r>
+    </w:p>
+    <w:p>
+      <w:pPr>
+        <w:pStyle w:val="ListBullet"/>
+        <w:spacing w:after="80" w:line="280" w:lineRule="auto"/>
+      </w:pPr>
+      <w:r>
+        <w:rPr>
+          <w:rFonts w:ascii="Calibri" w:hAnsi="Calibri"/>
+          <w:color w:val="0F172A"/>
+          <w:sz w:val="22"/>
+        </w:rPr>
+        <w:t>Executar as migrations e verificar /health/db antes de disponibilizar o acesso público.</w:t>
+      </w:r>
+    </w:p>
+    <w:p>
+      <w:pPr>
+        <w:pStyle w:val="ListBullet"/>
+        <w:spacing w:after="80" w:line="280" w:lineRule="auto"/>
+      </w:pPr>
+      <w:r>
+        <w:rPr>
+          <w:rFonts w:ascii="Calibri" w:hAnsi="Calibri"/>
+          <w:color w:val="0F172A"/>
+          <w:sz w:val="22"/>
+        </w:rPr>
+        <w:t>Verificar login de aluno, professor e administrador em janela anônima para não confundir sessão com cache local.</w:t>
+      </w:r>
+    </w:p>
+    <w:p>
+      <w:pPr>
+        <w:pStyle w:val="ListBullet"/>
+        <w:spacing w:after="80" w:line="280" w:lineRule="auto"/>
+      </w:pPr>
+      <w:r>
+        <w:rPr>
+          <w:rFonts w:ascii="Calibri" w:hAnsi="Calibri"/>
+          <w:color w:val="0F172A"/>
+          <w:sz w:val="22"/>
+        </w:rPr>
+        <w:t>Publicar nova versão do service worker quando houver mudança nos ativos e validar que ele não armazena respostas de APIs autenticadas.</w:t>
+      </w:r>
+    </w:p>
+    <w:p>
+      <w:pPr>
+        <w:pStyle w:val="ListBullet"/>
+        <w:spacing w:after="80" w:line="280" w:lineRule="auto"/>
+      </w:pPr>
+      <w:r>
+        <w:rPr>
+          <w:rFonts w:ascii="Calibri" w:hAnsi="Calibri"/>
+          <w:color w:val="0F172A"/>
+          <w:sz w:val="22"/>
+        </w:rPr>
+        <w:t>Caso o Outlook bloqueie SMTP AUTH, optar por OAuth2/Microsoft Graph ou habilitar o método na caixa corporativa, sem reutilizar senhas pessoais.</w:t>
+      </w:r>
+    </w:p>
+    <w:p>
+      <w:pPr>
         <w:pStyle w:val="Heading1"/>
         <w:spacing w:before="320" w:after="160"/>
       </w:pPr>
@@ -5047,10 +6820,10 @@
         <w:rPr>
           <w:rFonts w:ascii="Calibri" w:hAnsi="Calibri"/>
           <w:b/>
-          <w:color w:val="2E74B5"/>
+          <w:color w:val="0F172A"/>
           <w:sz w:val="32"/>
         </w:rPr>
-        <w:t>12. Manutencao evolutiva</w:t>
+        <w:t>13. Manutenção evolutiva</w:t>
       </w:r>
     </w:p>
     <w:p>
@@ -5161,10 +6934,10 @@
         <w:rPr>
           <w:rFonts w:ascii="Calibri" w:hAnsi="Calibri"/>
           <w:b/>
-          <w:color w:val="2E74B5"/>
+          <w:color w:val="0F172A"/>
           <w:sz w:val="32"/>
         </w:rPr>
-        <w:t>13. Conclusao</w:t>
+        <w:t>14. Conclusão</w:t>
       </w:r>
     </w:p>
     <w:p>
@@ -5194,7 +6967,7 @@
           <w:color w:val="0F172A"/>
           <w:sz w:val="22"/>
         </w:rPr>
-        <w:t>A revisao tecnica corrigiu pontos que afetavam diretamente a experiencia do aluno e do professor, especialmente a exibicao de provas geradas e a finalizacao da prova ao vivo. Com a documentacao e as migracoes atualizadas, o projeto fica mais preparado para evolucao, testes e apresentacao academica.</w:t>
+        <w:t>A revisão técnica corrigiu pontos que afetavam diretamente a experiência do aluno e do professor, especialmente a exibição de provas geradas, a conclusão de tentativas, a persistência de conquistas e a navegação autenticada. Com a documentação, as migrações e os controles operacionais atualizados, o projeto fica mais preparado para evolução, testes e apresentação acadêmica.</w:t>
       </w:r>
     </w:p>
     <w:p>
@@ -5211,7 +6984,7 @@
         <w:rPr>
           <w:rFonts w:ascii="Calibri" w:hAnsi="Calibri"/>
           <w:b/>
-          <w:color w:val="2E74B5"/>
+          <w:color w:val="0F172A"/>
           <w:sz w:val="32"/>
         </w:rPr>
         <w:t>Referencias</w:t>
@@ -5282,7 +7055,7 @@
         <w:rPr>
           <w:rFonts w:ascii="Calibri" w:hAnsi="Calibri"/>
           <w:b/>
-          <w:color w:val="2E74B5"/>
+          <w:color w:val="0F172A"/>
           <w:sz w:val="32"/>
         </w:rPr>
         <w:t>Apendice A - Rotas principais</w:t>
@@ -5317,7 +7090,7 @@
               <w:end w:w="120" w:type="dxa"/>
             </w:tcMar>
             <w:vAlign w:val="center"/>
-            <w:shd w:fill="F2F4F7"/>
+            <w:shd w:fill="1F2937"/>
           </w:tcPr>
           <w:p>
             <w:pPr>
@@ -5328,7 +7101,7 @@
               <w:rPr>
                 <w:rFonts w:ascii="Calibri" w:hAnsi="Calibri"/>
                 <w:b/>
-                <w:color w:val="0F172A"/>
+                <w:color w:val="FFFFFF"/>
                 <w:sz w:val="20"/>
               </w:rPr>
               <w:t>Grupo</w:t>
@@ -5345,7 +7118,7 @@
               <w:end w:w="120" w:type="dxa"/>
             </w:tcMar>
             <w:vAlign w:val="center"/>
-            <w:shd w:fill="F2F4F7"/>
+            <w:shd w:fill="1F2937"/>
           </w:tcPr>
           <w:p>
             <w:pPr>
@@ -5356,7 +7129,7 @@
               <w:rPr>
                 <w:rFonts w:ascii="Calibri" w:hAnsi="Calibri"/>
                 <w:b/>
-                <w:color w:val="0F172A"/>
+                <w:color w:val="FFFFFF"/>
                 <w:sz w:val="20"/>
               </w:rPr>
               <w:t>Rotas exemplares</w:t>
@@ -5431,6 +7204,7 @@
               <w:end w:w="120" w:type="dxa"/>
             </w:tcMar>
             <w:vAlign w:val="center"/>
+            <w:shd w:fill="F3F4F6"/>
           </w:tcPr>
           <w:p>
             <w:pPr>
@@ -5458,6 +7232,7 @@
               <w:end w:w="120" w:type="dxa"/>
             </w:tcMar>
             <w:vAlign w:val="center"/>
+            <w:shd w:fill="F3F4F6"/>
           </w:tcPr>
           <w:p>
             <w:pPr>
@@ -5543,6 +7318,7 @@
               <w:end w:w="120" w:type="dxa"/>
             </w:tcMar>
             <w:vAlign w:val="center"/>
+            <w:shd w:fill="F3F4F6"/>
           </w:tcPr>
           <w:p>
             <w:pPr>
@@ -5570,6 +7346,7 @@
               <w:end w:w="120" w:type="dxa"/>
             </w:tcMar>
             <w:vAlign w:val="center"/>
+            <w:shd w:fill="F3F4F6"/>
           </w:tcPr>
           <w:p>
             <w:pPr>
@@ -5655,6 +7432,7 @@
               <w:end w:w="120" w:type="dxa"/>
             </w:tcMar>
             <w:vAlign w:val="center"/>
+            <w:shd w:fill="F3F4F6"/>
           </w:tcPr>
           <w:p>
             <w:pPr>
@@ -5682,6 +7460,7 @@
               <w:end w:w="120" w:type="dxa"/>
             </w:tcMar>
             <w:vAlign w:val="center"/>
+            <w:shd w:fill="F3F4F6"/>
           </w:tcPr>
           <w:p>
             <w:pPr>
@@ -5711,7 +7490,7 @@
         <w:rPr>
           <w:rFonts w:ascii="Calibri" w:hAnsi="Calibri"/>
           <w:b/>
-          <w:color w:val="2E74B5"/>
+          <w:color w:val="0F172A"/>
           <w:sz w:val="32"/>
         </w:rPr>
         <w:t>Apendice B - Checklist operacional</w:t>
@@ -5827,7 +7606,7 @@
         <w:color w:val="64748B"/>
         <w:sz w:val="18"/>
       </w:rPr>
-      <w:t>Projeto academico e tecnico - FormulaVest</w:t>
+      <w:t>FormulaVest | Documentação técnica e operacional</w:t>
     </w:r>
   </w:p>
 </w:ftr>
@@ -5847,7 +7626,7 @@
         <w:color w:val="64748B"/>
         <w:sz w:val="18"/>
       </w:rPr>
-      <w:t>FormulaVest - Documentacao Tecnica</w:t>
+      <w:t>FormulaVest | Documento técnico do projeto</w:t>
     </w:r>
   </w:p>
 </w:hdr>
@@ -6287,7 +8066,7 @@
       <w:rFonts w:asciiTheme="majorHAnsi" w:eastAsiaTheme="majorEastAsia" w:hAnsiTheme="majorHAnsi" w:cstheme="majorBidi" w:ascii="Calibri" w:hAnsi="Calibri"/>
       <w:b/>
       <w:bCs/>
-      <w:color w:val="2E74B5"/>
+      <w:color w:val="0F172A"/>
       <w:sz w:val="32"/>
       <w:szCs w:val="28"/>
     </w:rPr>
@@ -6311,7 +8090,7 @@
       <w:rFonts w:asciiTheme="majorHAnsi" w:eastAsiaTheme="majorEastAsia" w:hAnsiTheme="majorHAnsi" w:cstheme="majorBidi" w:ascii="Calibri" w:hAnsi="Calibri"/>
       <w:b/>
       <w:bCs/>
-      <w:color w:val="2E74B5"/>
+      <w:color w:val="0F172A"/>
       <w:sz w:val="26"/>
       <w:szCs w:val="26"/>
     </w:rPr>
@@ -6335,7 +8114,7 @@
       <w:rFonts w:asciiTheme="majorHAnsi" w:eastAsiaTheme="majorEastAsia" w:hAnsiTheme="majorHAnsi" w:cstheme="majorBidi" w:ascii="Calibri" w:hAnsi="Calibri"/>
       <w:b/>
       <w:bCs/>
-      <w:color w:val="1F4D78"/>
+      <w:color w:val="0F172A"/>
       <w:sz w:val="24"/>
     </w:rPr>
   </w:style>
@@ -6574,11 +8353,12 @@
       <w:contextualSpacing/>
     </w:pPr>
     <w:rPr>
-      <w:rFonts w:asciiTheme="majorHAnsi" w:eastAsiaTheme="majorEastAsia" w:hAnsiTheme="majorHAnsi" w:cstheme="majorBidi"/>
-      <w:color w:val="17365D" w:themeColor="text2" w:themeShade="BF"/>
+      <w:rFonts w:asciiTheme="majorHAnsi" w:eastAsiaTheme="majorEastAsia" w:hAnsiTheme="majorHAnsi" w:cstheme="majorBidi" w:ascii="Calibri" w:hAnsi="Calibri"/>
+      <w:b/>
+      <w:color w:val="0F172A"/>
       <w:spacing w:val="5"/>
       <w:kern w:val="28"/>
-      <w:sz w:val="52"/>
+      <w:sz w:val="44"/>
       <w:szCs w:val="52"/>
     </w:rPr>
   </w:style>

</xml_diff>